<commit_message>
Update investor content for 2026-08-09
</commit_message>
<xml_diff>
--- a/public/investor-downloads/daily-brief-2026-08-09.docx
+++ b/public/investor-downloads/daily-brief-2026-08-09.docx
@@ -8,7 +8,7 @@
       </w:pPr>
       <w:r>
         <w:rPr>
-          <w:rFonts w:ascii="Calibri" w:hAnsi="Calibri" w:eastAsia="Heiti TC"/>
+          <w:rFonts w:ascii="Calibri" w:hAnsi="Calibri" w:eastAsia="Hiragino Sans GB"/>
           <w:b/>
           <w:i w:val="0"/>
           <w:color w:val="285B9D"/>
@@ -24,7 +24,7 @@
       </w:pPr>
       <w:r>
         <w:rPr>
-          <w:rFonts w:ascii="Calibri" w:hAnsi="Calibri" w:eastAsia="Heiti TC"/>
+          <w:rFonts w:ascii="Calibri" w:hAnsi="Calibri" w:eastAsia="Hiragino Sans GB"/>
           <w:b w:val="0"/>
           <w:i w:val="0"/>
         </w:rPr>
@@ -38,7 +38,7 @@
       </w:pPr>
       <w:r>
         <w:rPr>
-          <w:rFonts w:ascii="Calibri" w:hAnsi="Calibri" w:eastAsia="Heiti TC"/>
+          <w:rFonts w:ascii="Calibri" w:hAnsi="Calibri" w:eastAsia="Hiragino Sans GB"/>
           <w:b w:val="0"/>
           <w:i w:val="0"/>
         </w:rPr>
@@ -51,7 +51,7 @@
       </w:pPr>
       <w:r>
         <w:rPr>
-          <w:rFonts w:ascii="Calibri" w:hAnsi="Calibri" w:eastAsia="Heiti TC"/>
+          <w:rFonts w:ascii="Calibri" w:hAnsi="Calibri" w:eastAsia="Hiragino Sans GB"/>
           <w:b/>
           <w:i w:val="0"/>
           <w:color w:val="0B2545"/>
@@ -66,13 +66,13 @@
       </w:pPr>
       <w:r>
         <w:rPr>
-          <w:rFonts w:ascii="Calibri" w:hAnsi="Calibri" w:eastAsia="Heiti TC"/>
+          <w:rFonts w:ascii="Calibri" w:hAnsi="Calibri" w:eastAsia="Hiragino Sans GB"/>
           <w:b w:val="0"/>
           <w:i w:val="0"/>
           <w:color w:val="334155"/>
           <w:sz w:val="22"/>
         </w:rPr>
-        <w:t>2026-08-09 共纳入 76 篇中文研究结果，覆盖 0 位活跃分析师和 3 条主要行业链，较 2026-08-08 的主题变化可在右侧动量表中核对。简报优先呈现可被报告链接追溯的结论，而不是孤立摘要。</w:t>
+        <w:t>2026-08-09 共纳入 255 篇中文研究结果，覆盖 0 位活跃分析师和 5 条主要行业链，较 2026-08-08 的主题变化可在右侧动量表中核对。简报优先呈现可被报告链接追溯的结论，而不是孤立摘要。</w:t>
       </w:r>
     </w:p>
     <w:tbl>
@@ -101,7 +101,7 @@
             </w:pPr>
             <w:r>
               <w:rPr>
-                <w:rFonts w:ascii="Calibri" w:hAnsi="Calibri" w:eastAsia="Heiti TC"/>
+                <w:rFonts w:ascii="Calibri" w:hAnsi="Calibri" w:eastAsia="Hiragino Sans GB"/>
                 <w:b/>
                 <w:color w:val="667085"/>
                 <w:sz w:val="17"/>
@@ -111,12 +111,12 @@
             </w:r>
             <w:r>
               <w:rPr>
-                <w:rFonts w:ascii="Calibri" w:hAnsi="Calibri" w:eastAsia="Heiti TC"/>
+                <w:rFonts w:ascii="Calibri" w:hAnsi="Calibri" w:eastAsia="Hiragino Sans GB"/>
                 <w:b/>
                 <w:color w:val="285B9D"/>
                 <w:sz w:val="36"/>
               </w:rPr>
-              <w:t>76</w:t>
+              <w:t>255</w:t>
             </w:r>
           </w:p>
         </w:tc>
@@ -132,7 +132,7 @@
             </w:pPr>
             <w:r>
               <w:rPr>
-                <w:rFonts w:ascii="Calibri" w:hAnsi="Calibri" w:eastAsia="Heiti TC"/>
+                <w:rFonts w:ascii="Calibri" w:hAnsi="Calibri" w:eastAsia="Hiragino Sans GB"/>
                 <w:b/>
                 <w:color w:val="667085"/>
                 <w:sz w:val="17"/>
@@ -142,7 +142,7 @@
             </w:r>
             <w:r>
               <w:rPr>
-                <w:rFonts w:ascii="Calibri" w:hAnsi="Calibri" w:eastAsia="Heiti TC"/>
+                <w:rFonts w:ascii="Calibri" w:hAnsi="Calibri" w:eastAsia="Hiragino Sans GB"/>
                 <w:b/>
                 <w:color w:val="237A5B"/>
                 <w:sz w:val="36"/>
@@ -163,7 +163,7 @@
             </w:pPr>
             <w:r>
               <w:rPr>
-                <w:rFonts w:ascii="Calibri" w:hAnsi="Calibri" w:eastAsia="Heiti TC"/>
+                <w:rFonts w:ascii="Calibri" w:hAnsi="Calibri" w:eastAsia="Hiragino Sans GB"/>
                 <w:b/>
                 <w:color w:val="667085"/>
                 <w:sz w:val="17"/>
@@ -173,12 +173,12 @@
             </w:r>
             <w:r>
               <w:rPr>
-                <w:rFonts w:ascii="Calibri" w:hAnsi="Calibri" w:eastAsia="Heiti TC"/>
+                <w:rFonts w:ascii="Calibri" w:hAnsi="Calibri" w:eastAsia="Hiragino Sans GB"/>
                 <w:b/>
                 <w:color w:val="A8731B"/>
                 <w:sz w:val="36"/>
               </w:rPr>
-              <w:t>3</w:t>
+              <w:t>5</w:t>
             </w:r>
           </w:p>
         </w:tc>
@@ -194,7 +194,7 @@
             </w:pPr>
             <w:r>
               <w:rPr>
-                <w:rFonts w:ascii="Calibri" w:hAnsi="Calibri" w:eastAsia="Heiti TC"/>
+                <w:rFonts w:ascii="Calibri" w:hAnsi="Calibri" w:eastAsia="Hiragino Sans GB"/>
                 <w:b/>
                 <w:color w:val="667085"/>
                 <w:sz w:val="17"/>
@@ -204,7 +204,7 @@
             </w:r>
             <w:r>
               <w:rPr>
-                <w:rFonts w:ascii="Calibri" w:hAnsi="Calibri" w:eastAsia="Heiti TC"/>
+                <w:rFonts w:ascii="Calibri" w:hAnsi="Calibri" w:eastAsia="Hiragino Sans GB"/>
                 <w:b/>
                 <w:color w:val="B43D49"/>
                 <w:sz w:val="36"/>
@@ -268,7 +268,7 @@
       </w:pPr>
       <w:r>
         <w:rPr>
-          <w:rFonts w:ascii="Calibri" w:hAnsi="Calibri" w:eastAsia="Heiti TC"/>
+          <w:rFonts w:ascii="Calibri" w:hAnsi="Calibri" w:eastAsia="Hiragino Sans GB"/>
           <w:b w:val="0"/>
           <w:i/>
           <w:color w:val="667085"/>
@@ -292,7 +292,7 @@
       </w:pPr>
       <w:r>
         <w:rPr>
-          <w:rFonts w:ascii="Calibri" w:hAnsi="Calibri" w:eastAsia="Heiti TC"/>
+          <w:rFonts w:ascii="Calibri" w:hAnsi="Calibri" w:eastAsia="Hiragino Sans GB"/>
           <w:b/>
           <w:color w:val="285B9D"/>
           <w:sz w:val="21"/>
@@ -304,9 +304,9 @@
           <w:rPr>
             <w:color w:val="285B9D"/>
             <w:u w:val="single"/>
-            <w:rFonts w:eastAsia="Heiti TC" w:ascii="Calibri" w:hAnsi="Calibri"/>
+            <w:rFonts w:eastAsia="Hiragino Sans GB" w:ascii="Calibri" w:hAnsi="Calibri"/>
           </w:rPr>
-          <w:t>工业制造周报研究 是今日最高权重结论，核心证据来自 未识别，关联 宏观通胀传导。</w:t>
+          <w:t>research discussion Session Brief 是今日最高权重结论，核心证据来自 未识别，关联 AI 基础设施。</w:t>
         </w:r>
       </w:hyperlink>
     </w:p>
@@ -317,7 +317,7 @@
       </w:pPr>
       <w:r>
         <w:rPr>
-          <w:rFonts w:ascii="Calibri" w:hAnsi="Calibri" w:eastAsia="Heiti TC"/>
+          <w:rFonts w:ascii="Calibri" w:hAnsi="Calibri" w:eastAsia="Hiragino Sans GB"/>
           <w:b/>
           <w:color w:val="285B9D"/>
           <w:sz w:val="21"/>
@@ -326,11 +326,11 @@
       </w:r>
       <w:r>
         <w:rPr>
-          <w:rFonts w:ascii="Calibri" w:hAnsi="Calibri" w:eastAsia="Heiti TC"/>
+          <w:rFonts w:ascii="Calibri" w:hAnsi="Calibri" w:eastAsia="Hiragino Sans GB"/>
           <w:color w:val="111827"/>
           <w:sz w:val="21"/>
         </w:rPr>
-        <w:t>AI 今日 降温，当日计数 54，前一日计数 210。</w:t>
+        <w:t>通胀 今日 升温，当日计数 237，前一日计数 205。</w:t>
       </w:r>
     </w:p>
     <w:p>
@@ -340,21 +340,21 @@
       </w:pPr>
       <w:r>
         <w:rPr>
-          <w:rFonts w:ascii="Calibri" w:hAnsi="Calibri" w:eastAsia="Heiti TC"/>
+          <w:rFonts w:ascii="Calibri" w:hAnsi="Calibri" w:eastAsia="Hiragino Sans GB"/>
           <w:b/>
           <w:color w:val="285B9D"/>
           <w:sz w:val="21"/>
         </w:rPr>
         <w:t xml:space="preserve">风险焦点: </w:t>
       </w:r>
-      <w:hyperlink r:id="rId13">
+      <w:hyperlink r:id="rId12">
         <w:r>
           <w:rPr>
             <w:color w:val="285B9D"/>
             <w:u w:val="single"/>
-            <w:rFonts w:eastAsia="Heiti TC" w:ascii="Calibri" w:hAnsi="Calibri"/>
+            <w:rFonts w:eastAsia="Hiragino Sans GB" w:ascii="Calibri" w:hAnsi="Calibri"/>
           </w:rPr>
-          <w:t>风险矩阵最需要跟踪的是 电力与电网：AI电力瓶颈第二阶段重估，2026-08-06。</w:t>
+          <w:t>风险矩阵最需要跟踪的是 AI 基础设施：research discussion Session Brief。</w:t>
         </w:r>
       </w:hyperlink>
     </w:p>
@@ -365,21 +365,21 @@
       </w:pPr>
       <w:r>
         <w:rPr>
-          <w:rFonts w:ascii="Calibri" w:hAnsi="Calibri" w:eastAsia="Heiti TC"/>
+          <w:rFonts w:ascii="Calibri" w:hAnsi="Calibri" w:eastAsia="Hiragino Sans GB"/>
           <w:b/>
           <w:color w:val="285B9D"/>
           <w:sz w:val="21"/>
         </w:rPr>
         <w:t xml:space="preserve">证据密度: </w:t>
       </w:r>
-      <w:hyperlink r:id="rId14">
+      <w:hyperlink r:id="rId13">
         <w:r>
           <w:rPr>
             <w:color w:val="285B9D"/>
             <w:u w:val="single"/>
-            <w:rFonts w:eastAsia="Heiti TC" w:ascii="Calibri" w:hAnsi="Calibri"/>
+            <w:rFonts w:eastAsia="Hiragino Sans GB" w:ascii="Calibri" w:hAnsi="Calibri"/>
           </w:rPr>
-          <w:t>宏观通胀传导 今日 68 条、近七日 1793 条，风险信号 1242 条。</w:t>
+          <w:t>宏观通胀传导 今日 241 条、近七日 2004 条，风险信号 1385 条。</w:t>
         </w:r>
       </w:hyperlink>
     </w:p>
@@ -403,7 +403,7 @@
           <w:p>
             <w:r>
               <w:rPr>
-                <w:rFonts w:ascii="Calibri" w:hAnsi="Calibri" w:eastAsia="Heiti TC"/>
+                <w:rFonts w:ascii="Calibri" w:hAnsi="Calibri" w:eastAsia="Hiragino Sans GB"/>
                 <w:b/>
                 <w:color w:val="7A5A00"/>
                 <w:sz w:val="21"/>
@@ -412,7 +412,7 @@
             </w:r>
             <w:r>
               <w:rPr>
-                <w:rFonts w:ascii="Calibri" w:hAnsi="Calibri" w:eastAsia="Heiti TC"/>
+                <w:rFonts w:ascii="Calibri" w:hAnsi="Calibri" w:eastAsia="Hiragino Sans GB"/>
                 <w:color w:val="7C2D12"/>
                 <w:sz w:val="21"/>
               </w:rPr>
@@ -456,7 +456,7 @@
                     <pic:cNvPicPr/>
                   </pic:nvPicPr>
                   <pic:blipFill>
-                    <a:blip r:embed="rId15"/>
+                    <a:blip r:embed="rId14"/>
                     <a:stretch>
                       <a:fillRect/>
                     </a:stretch>
@@ -483,7 +483,7 @@
       </w:pPr>
       <w:r>
         <w:rPr>
-          <w:rFonts w:ascii="Calibri" w:hAnsi="Calibri" w:eastAsia="Heiti TC"/>
+          <w:rFonts w:ascii="Calibri" w:hAnsi="Calibri" w:eastAsia="Hiragino Sans GB"/>
           <w:b w:val="0"/>
           <w:i/>
           <w:color w:val="667085"/>
@@ -513,7 +513,7 @@
                     <pic:cNvPicPr/>
                   </pic:nvPicPr>
                   <pic:blipFill>
-                    <a:blip r:embed="rId16"/>
+                    <a:blip r:embed="rId15"/>
                     <a:stretch>
                       <a:fillRect/>
                     </a:stretch>
@@ -540,7 +540,7 @@
       </w:pPr>
       <w:r>
         <w:rPr>
-          <w:rFonts w:ascii="Calibri" w:hAnsi="Calibri" w:eastAsia="Heiti TC"/>
+          <w:rFonts w:ascii="Calibri" w:hAnsi="Calibri" w:eastAsia="Hiragino Sans GB"/>
           <w:b w:val="0"/>
           <w:i/>
           <w:color w:val="667085"/>
@@ -575,7 +575,7 @@
                     <pic:cNvPicPr/>
                   </pic:nvPicPr>
                   <pic:blipFill>
-                    <a:blip r:embed="rId17"/>
+                    <a:blip r:embed="rId16"/>
                     <a:stretch>
                       <a:fillRect/>
                     </a:stretch>
@@ -602,7 +602,7 @@
       </w:pPr>
       <w:r>
         <w:rPr>
-          <w:rFonts w:ascii="Calibri" w:hAnsi="Calibri" w:eastAsia="Heiti TC"/>
+          <w:rFonts w:ascii="Calibri" w:hAnsi="Calibri" w:eastAsia="Hiragino Sans GB"/>
           <w:b w:val="0"/>
           <w:i/>
           <w:color w:val="667085"/>
@@ -637,7 +637,7 @@
                     <pic:cNvPicPr/>
                   </pic:nvPicPr>
                   <pic:blipFill>
-                    <a:blip r:embed="rId18"/>
+                    <a:blip r:embed="rId17"/>
                     <a:stretch>
                       <a:fillRect/>
                     </a:stretch>
@@ -664,7 +664,7 @@
       </w:pPr>
       <w:r>
         <w:rPr>
-          <w:rFonts w:ascii="Calibri" w:hAnsi="Calibri" w:eastAsia="Heiti TC"/>
+          <w:rFonts w:ascii="Calibri" w:hAnsi="Calibri" w:eastAsia="Hiragino Sans GB"/>
           <w:b w:val="0"/>
           <w:i/>
           <w:color w:val="667085"/>
@@ -687,13 +687,13 @@
       </w:pPr>
       <w:r>
         <w:rPr>
-          <w:rFonts w:ascii="Calibri" w:hAnsi="Calibri" w:eastAsia="Heiti TC"/>
+          <w:rFonts w:ascii="Calibri" w:hAnsi="Calibri" w:eastAsia="Hiragino Sans GB"/>
           <w:b/>
           <w:i w:val="0"/>
           <w:color w:val="0B2545"/>
           <w:sz w:val="23"/>
         </w:rPr>
-        <w:t>1. 工业制造周报研究</w:t>
+        <w:t>1. research discussion Session Brief</w:t>
       </w:r>
     </w:p>
     <w:p>
@@ -702,13 +702,13 @@
       </w:pPr>
       <w:r>
         <w:rPr>
-          <w:rFonts w:ascii="Calibri" w:hAnsi="Calibri" w:eastAsia="Heiti TC"/>
+          <w:rFonts w:ascii="Calibri" w:hAnsi="Calibri" w:eastAsia="Hiragino Sans GB"/>
           <w:b w:val="0"/>
           <w:i w:val="0"/>
           <w:color w:val="667085"/>
           <w:sz w:val="17"/>
         </w:rPr>
-        <w:t>未识别 · 宏观通胀传导 · score 43.0</w:t>
+        <w:t>未识别 · AI 基础设施 · score 58.6</w:t>
       </w:r>
     </w:p>
     <w:p>
@@ -717,13 +717,13 @@
       </w:pPr>
       <w:r>
         <w:rPr>
-          <w:rFonts w:ascii="Calibri" w:hAnsi="Calibri" w:eastAsia="Heiti TC"/>
+          <w:rFonts w:ascii="Calibri" w:hAnsi="Calibri" w:eastAsia="Hiragino Sans GB"/>
           <w:b w:val="0"/>
           <w:i w:val="0"/>
           <w:color w:val="334155"/>
           <w:sz w:val="20"/>
         </w:rPr>
-        <w:t>锚定日期： date +%Y-%m-%d 返回 2026-08-09。覆盖窗口为最近完成交易周 2026-08-03 至 2026-08-07，美国股票市场五个交易日均纳入。上游文件 01 weekly plan.md 已读取并作为研究清单来源。</w:t>
+        <w:t>Board ID: 88eb7f72-5e9f-4027-8bb7-5607dedcda9e - Shared Agent Route session: 5010a8b7-9fa0-4940-af26-3139102b7151 - Root topic: AI 算力交付瓶颈：从 GPU 到电力/电网转型 - Current ca...</w:t>
       </w:r>
     </w:p>
     <w:p>
@@ -732,7 +732,7 @@
       </w:pPr>
       <w:r>
         <w:rPr>
-          <w:rFonts w:ascii="Calibri" w:hAnsi="Calibri" w:eastAsia="Heiti TC"/>
+          <w:rFonts w:ascii="Calibri" w:hAnsi="Calibri" w:eastAsia="Hiragino Sans GB"/>
           <w:b w:val="0"/>
           <w:i w:val="0"/>
           <w:color w:val="667085"/>
@@ -745,9 +745,9 @@
           <w:rPr>
             <w:color w:val="285B9D"/>
             <w:u w:val="single"/>
-            <w:rFonts w:eastAsia="Heiti TC" w:ascii="Calibri" w:hAnsi="Calibri"/>
+            <w:rFonts w:eastAsia="Hiragino Sans GB" w:ascii="Calibri" w:hAnsi="Calibri"/>
           </w:rPr>
-          <w:t>reports/archive-6ffd4b5d63a8</w:t>
+          <w:t>reports/archive-d7796555327c</w:t>
         </w:r>
       </w:hyperlink>
     </w:p>
@@ -757,13 +757,13 @@
       </w:pPr>
       <w:r>
         <w:rPr>
-          <w:rFonts w:ascii="Calibri" w:hAnsi="Calibri" w:eastAsia="Heiti TC"/>
+          <w:rFonts w:ascii="Calibri" w:hAnsi="Calibri" w:eastAsia="Hiragino Sans GB"/>
           <w:b/>
           <w:i w:val="0"/>
           <w:color w:val="0B2545"/>
           <w:sz w:val="23"/>
         </w:rPr>
-        <w:t>2. 研究记录 — 人民币汇率阈值与中国政策对冲空间</w:t>
+        <w:t>2. GOES供给：Cleveland-Cliffs之外的扩产能否打破变压器瓶颈？</w:t>
       </w:r>
     </w:p>
     <w:p>
@@ -772,13 +772,13 @@
       </w:pPr>
       <w:r>
         <w:rPr>
-          <w:rFonts w:ascii="Calibri" w:hAnsi="Calibri" w:eastAsia="Heiti TC"/>
+          <w:rFonts w:ascii="Calibri" w:hAnsi="Calibri" w:eastAsia="Hiragino Sans GB"/>
           <w:b w:val="0"/>
           <w:i w:val="0"/>
           <w:color w:val="667085"/>
           <w:sz w:val="17"/>
         </w:rPr>
-        <w:t>未识别 · 宏观通胀传导 · score 42.7</w:t>
+        <w:t>未识别 · 工业供给瓶颈 · score 52.8</w:t>
       </w:r>
     </w:p>
     <w:p>
@@ -787,13 +787,13 @@
       </w:pPr>
       <w:r>
         <w:rPr>
-          <w:rFonts w:ascii="Calibri" w:hAnsi="Calibri" w:eastAsia="Heiti TC"/>
+          <w:rFonts w:ascii="Calibri" w:hAnsi="Calibri" w:eastAsia="Hiragino Sans GB"/>
           <w:b w:val="0"/>
           <w:i w:val="0"/>
           <w:color w:val="334155"/>
           <w:sz w:val="20"/>
         </w:rPr>
-        <w:t>研究记录 — 人民币汇率阈值与中国政策对冲空间 作者： 全球宏观分析师 日期： 2026-08-09 立场： synthesize（综合） 问题： 在美联储9月鹰派维持利率的情形下，USD/CNY或USD/CNH到达什么阈值...</w:t>
+        <w:t>GOES供给：Cleveland-Cliffs之外的扩产能否打破变压器瓶颈？ 材料行业分析师 工作日期：2026-08-09 立场：support</w:t>
       </w:r>
     </w:p>
     <w:p>
@@ -802,7 +802,77 @@
       </w:pPr>
       <w:r>
         <w:rPr>
-          <w:rFonts w:ascii="Calibri" w:hAnsi="Calibri" w:eastAsia="Heiti TC"/>
+          <w:rFonts w:ascii="Calibri" w:hAnsi="Calibri" w:eastAsia="Hiragino Sans GB"/>
+          <w:b w:val="0"/>
+          <w:i w:val="0"/>
+          <w:color w:val="667085"/>
+          <w:sz w:val="17"/>
+        </w:rPr>
+        <w:t xml:space="preserve">Report: </w:t>
+      </w:r>
+      <w:hyperlink r:id="rId18">
+        <w:r>
+          <w:rPr>
+            <w:color w:val="285B9D"/>
+            <w:u w:val="single"/>
+            <w:rFonts w:eastAsia="Hiragino Sans GB" w:ascii="Calibri" w:hAnsi="Calibri"/>
+          </w:rPr>
+          <w:t>reports/archive-8aa2f6ba2610</w:t>
+        </w:r>
+      </w:hyperlink>
+    </w:p>
+    <w:p>
+      <w:pPr>
+        <w:spacing w:before="0" w:after="40" w:line="264" w:lineRule="auto"/>
+      </w:pPr>
+      <w:r>
+        <w:rPr>
+          <w:rFonts w:ascii="Calibri" w:hAnsi="Calibri" w:eastAsia="Hiragino Sans GB"/>
+          <w:b/>
+          <w:i w:val="0"/>
+          <w:color w:val="0B2545"/>
+          <w:sz w:val="23"/>
+        </w:rPr>
+        <w:t>3. GOES约束下的变压器交付曲线：哪些已公告AI数据中心MW最可能送电延期，以及如何量化ROIC与估值折价</w:t>
+      </w:r>
+    </w:p>
+    <w:p>
+      <w:pPr>
+        <w:spacing w:before="0" w:after="40" w:line="264" w:lineRule="auto"/>
+      </w:pPr>
+      <w:r>
+        <w:rPr>
+          <w:rFonts w:ascii="Calibri" w:hAnsi="Calibri" w:eastAsia="Hiragino Sans GB"/>
+          <w:b w:val="0"/>
+          <w:i w:val="0"/>
+          <w:color w:val="667085"/>
+          <w:sz w:val="17"/>
+        </w:rPr>
+        <w:t>未识别 · 工业供给瓶颈 · score 47.7</w:t>
+      </w:r>
+    </w:p>
+    <w:p>
+      <w:pPr>
+        <w:spacing w:before="0" w:after="100" w:line="264" w:lineRule="auto"/>
+      </w:pPr>
+      <w:r>
+        <w:rPr>
+          <w:rFonts w:ascii="Calibri" w:hAnsi="Calibri" w:eastAsia="Hiragino Sans GB"/>
+          <w:b w:val="0"/>
+          <w:i w:val="0"/>
+          <w:color w:val="334155"/>
+          <w:sz w:val="20"/>
+        </w:rPr>
+        <w:t>GOES约束下的变压器交付曲线：哪些已公告AI数据中心MW最可能送电延期，以及如何量化ROIC与估值折价</w:t>
+      </w:r>
+    </w:p>
+    <w:p>
+      <w:pPr>
+        <w:spacing w:before="0" w:after="160" w:line="264" w:lineRule="auto"/>
+      </w:pPr>
+      <w:r>
+        <w:rPr>
+          <w:rFonts w:ascii="Calibri" w:hAnsi="Calibri" w:eastAsia="Hiragino Sans GB"/>
           <w:b w:val="0"/>
           <w:i w:val="0"/>
           <w:color w:val="667085"/>
@@ -815,9 +885,9 @@
           <w:rPr>
             <w:color w:val="285B9D"/>
             <w:u w:val="single"/>
-            <w:rFonts w:eastAsia="Heiti TC" w:ascii="Calibri" w:hAnsi="Calibri"/>
+            <w:rFonts w:eastAsia="Hiragino Sans GB" w:ascii="Calibri" w:hAnsi="Calibri"/>
           </w:rPr>
-          <w:t>reports/archive-e7ac06933f52</w:t>
+          <w:t>reports/archive-329bb005940f</w:t>
         </w:r>
       </w:hyperlink>
     </w:p>
@@ -827,13 +897,13 @@
       </w:pPr>
       <w:r>
         <w:rPr>
-          <w:rFonts w:ascii="Calibri" w:hAnsi="Calibri" w:eastAsia="Heiti TC"/>
+          <w:rFonts w:ascii="Calibri" w:hAnsi="Calibri" w:eastAsia="Hiragino Sans GB"/>
           <w:b/>
           <w:i w:val="0"/>
           <w:color w:val="0B2545"/>
           <w:sz w:val="23"/>
         </w:rPr>
-        <w:t>3. 2026-08-09 美联储9月维持利率但保留鹰派指引下的跨资产配置</w:t>
+        <w:t>4. AI 算力交付瓶颈：从 GPU 稀缺到 Time-to-Power，2026-08-09</w:t>
       </w:r>
     </w:p>
     <w:p>
@@ -842,13 +912,13 @@
       </w:pPr>
       <w:r>
         <w:rPr>
-          <w:rFonts w:ascii="Calibri" w:hAnsi="Calibri" w:eastAsia="Heiti TC"/>
+          <w:rFonts w:ascii="Calibri" w:hAnsi="Calibri" w:eastAsia="Hiragino Sans GB"/>
           <w:b w:val="0"/>
           <w:i w:val="0"/>
           <w:color w:val="667085"/>
           <w:sz w:val="17"/>
         </w:rPr>
-        <w:t>未识别 · 宏观通胀传导 · score 42.7</w:t>
+        <w:t>未识别 · AI 基础设施 · score 47.6</w:t>
       </w:r>
     </w:p>
     <w:p>
@@ -857,13 +927,13 @@
       </w:pPr>
       <w:r>
         <w:rPr>
-          <w:rFonts w:ascii="Calibri" w:hAnsi="Calibri" w:eastAsia="Heiti TC"/>
+          <w:rFonts w:ascii="Calibri" w:hAnsi="Calibri" w:eastAsia="Hiragino Sans GB"/>
           <w:b w:val="0"/>
           <w:i w:val="0"/>
           <w:color w:val="334155"/>
           <w:sz w:val="20"/>
         </w:rPr>
-        <w:t>截至研究所工作日 2026-08-09，本报告由 asset-allocator （大类资产配置师）视角撰写，并为 chief-strategist （首席策略师）做跨资产综合：如果基准情形是美联储9月维持利率不变但保留鹰派指...</w:t>
+        <w:t>AI 算力交付瓶颈：从 GPU 稀缺到 Time-to-Power，2026-08-09</w:t>
       </w:r>
     </w:p>
     <w:p>
@@ -872,7 +942,7 @@
       </w:pPr>
       <w:r>
         <w:rPr>
-          <w:rFonts w:ascii="Calibri" w:hAnsi="Calibri" w:eastAsia="Heiti TC"/>
+          <w:rFonts w:ascii="Calibri" w:hAnsi="Calibri" w:eastAsia="Hiragino Sans GB"/>
           <w:b w:val="0"/>
           <w:i w:val="0"/>
           <w:color w:val="667085"/>
@@ -885,9 +955,9 @@
           <w:rPr>
             <w:color w:val="285B9D"/>
             <w:u w:val="single"/>
-            <w:rFonts w:eastAsia="Heiti TC" w:ascii="Calibri" w:hAnsi="Calibri"/>
+            <w:rFonts w:eastAsia="Hiragino Sans GB" w:ascii="Calibri" w:hAnsi="Calibri"/>
           </w:rPr>
-          <w:t>reports/archive-416507da46e1</w:t>
+          <w:t>reports/archive-8d9a70989126</w:t>
         </w:r>
       </w:hyperlink>
     </w:p>
@@ -897,13 +967,13 @@
       </w:pPr>
       <w:r>
         <w:rPr>
-          <w:rFonts w:ascii="Calibri" w:hAnsi="Calibri" w:eastAsia="Heiti TC"/>
+          <w:rFonts w:ascii="Calibri" w:hAnsi="Calibri" w:eastAsia="Hiragino Sans GB"/>
           <w:b/>
           <w:i w:val="0"/>
           <w:color w:val="0B2545"/>
           <w:sz w:val="23"/>
         </w:rPr>
-        <w:t>4. 前序研究片 — 9月美联储加息压力测试下的人民币与央行政策空间</w:t>
+        <w:t>5. AI数据中心物理瓶颈可投资排序，2026-08-09</w:t>
       </w:r>
     </w:p>
     <w:p>
@@ -912,13 +982,13 @@
       </w:pPr>
       <w:r>
         <w:rPr>
-          <w:rFonts w:ascii="Calibri" w:hAnsi="Calibri" w:eastAsia="Heiti TC"/>
+          <w:rFonts w:ascii="Calibri" w:hAnsi="Calibri" w:eastAsia="Hiragino Sans GB"/>
           <w:b w:val="0"/>
           <w:i w:val="0"/>
           <w:color w:val="667085"/>
           <w:sz w:val="17"/>
         </w:rPr>
-        <w:t>未识别 · 宏观通胀传导 · score 42.4</w:t>
+        <w:t>未识别 · AI 基础设施 · score 47.4</w:t>
       </w:r>
     </w:p>
     <w:p>
@@ -927,13 +997,13 @@
       </w:pPr>
       <w:r>
         <w:rPr>
-          <w:rFonts w:ascii="Calibri" w:hAnsi="Calibri" w:eastAsia="Heiti TC"/>
+          <w:rFonts w:ascii="Calibri" w:hAnsi="Calibri" w:eastAsia="Hiragino Sans GB"/>
           <w:b w:val="0"/>
           <w:i w:val="0"/>
           <w:color w:val="334155"/>
           <w:sz w:val="20"/>
         </w:rPr>
-        <w:t>分析师: global-macro(全球宏观分析师) 日期: 2026-08-09(新加坡时区) 片</w:t>
+        <w:t>截至研究所工作日期2026-08-09，shell date +%Y-%m-%d 返回 2026-08-09 [自测算: shell date]，本报告对研究记录1的结论做压力测试而非推翻：美国电网接入是最深的物理瓶颈，但若同时考察订单能...</w:t>
       </w:r>
     </w:p>
     <w:p>
@@ -942,7 +1012,7 @@
       </w:pPr>
       <w:r>
         <w:rPr>
-          <w:rFonts w:ascii="Calibri" w:hAnsi="Calibri" w:eastAsia="Heiti TC"/>
+          <w:rFonts w:ascii="Calibri" w:hAnsi="Calibri" w:eastAsia="Hiragino Sans GB"/>
           <w:b w:val="0"/>
           <w:i w:val="0"/>
           <w:color w:val="667085"/>
@@ -955,9 +1025,9 @@
           <w:rPr>
             <w:color w:val="285B9D"/>
             <w:u w:val="single"/>
-            <w:rFonts w:eastAsia="Heiti TC" w:ascii="Calibri" w:hAnsi="Calibri"/>
+            <w:rFonts w:eastAsia="Hiragino Sans GB" w:ascii="Calibri" w:hAnsi="Calibri"/>
           </w:rPr>
-          <w:t>reports/archive-ae24d4974c93</w:t>
+          <w:t>reports/archive-b9e428065099</w:t>
         </w:r>
       </w:hyperlink>
     </w:p>
@@ -967,13 +1037,13 @@
       </w:pPr>
       <w:r>
         <w:rPr>
-          <w:rFonts w:ascii="Calibri" w:hAnsi="Calibri" w:eastAsia="Heiti TC"/>
+          <w:rFonts w:ascii="Calibri" w:hAnsi="Calibri" w:eastAsia="Hiragino Sans GB"/>
           <w:b/>
           <w:i w:val="0"/>
           <w:color w:val="0B2545"/>
           <w:sz w:val="23"/>
         </w:rPr>
-        <w:t>5. 研究记录 — 汇率防御升级对在岸利率的被动收紧约束</w:t>
+        <w:t>6. prior research notes— 电网设备制造商：产能扩张周期与订单质量</w:t>
       </w:r>
     </w:p>
     <w:p>
@@ -982,13 +1052,13 @@
       </w:pPr>
       <w:r>
         <w:rPr>
-          <w:rFonts w:ascii="Calibri" w:hAnsi="Calibri" w:eastAsia="Heiti TC"/>
+          <w:rFonts w:ascii="Calibri" w:hAnsi="Calibri" w:eastAsia="Hiragino Sans GB"/>
           <w:b w:val="0"/>
           <w:i w:val="0"/>
           <w:color w:val="667085"/>
           <w:sz w:val="17"/>
         </w:rPr>
-        <w:t>未识别 · 宏观通胀传导 · score 42.1</w:t>
+        <w:t>未识别 · 工业供给瓶颈 · score 46.3</w:t>
       </w:r>
     </w:p>
     <w:p>
@@ -997,13 +1067,13 @@
       </w:pPr>
       <w:r>
         <w:rPr>
-          <w:rFonts w:ascii="Calibri" w:hAnsi="Calibri" w:eastAsia="Heiti TC"/>
+          <w:rFonts w:ascii="Calibri" w:hAnsi="Calibri" w:eastAsia="Hiragino Sans GB"/>
           <w:b w:val="0"/>
           <w:i w:val="0"/>
           <w:color w:val="334155"/>
           <w:sz w:val="20"/>
         </w:rPr>
-        <w:t>工作日期：2026-08-09（新加坡时区） 分析师：全球宏观分析师（汇率/利率压力测试） 立场：压力测试</w:t>
+        <w:t>prior research notes— 电网设备制造商：产能扩张周期与订单质量 工业制造分析师 工作日期：2026-08-09 立场：支持</w:t>
       </w:r>
     </w:p>
     <w:p>
@@ -1012,7 +1082,7 @@
       </w:pPr>
       <w:r>
         <w:rPr>
-          <w:rFonts w:ascii="Calibri" w:hAnsi="Calibri" w:eastAsia="Heiti TC"/>
+          <w:rFonts w:ascii="Calibri" w:hAnsi="Calibri" w:eastAsia="Hiragino Sans GB"/>
           <w:b w:val="0"/>
           <w:i w:val="0"/>
           <w:color w:val="667085"/>
@@ -1025,79 +1095,9 @@
           <w:rPr>
             <w:color w:val="285B9D"/>
             <w:u w:val="single"/>
-            <w:rFonts w:eastAsia="Heiti TC" w:ascii="Calibri" w:hAnsi="Calibri"/>
+            <w:rFonts w:eastAsia="Hiragino Sans GB" w:ascii="Calibri" w:hAnsi="Calibri"/>
           </w:rPr>
-          <w:t>reports/archive-ddbccfcf290f</w:t>
-        </w:r>
-      </w:hyperlink>
-    </w:p>
-    <w:p>
-      <w:pPr>
-        <w:spacing w:before="0" w:after="40" w:line="264" w:lineRule="auto"/>
-      </w:pPr>
-      <w:r>
-        <w:rPr>
-          <w:rFonts w:ascii="Calibri" w:hAnsi="Calibri" w:eastAsia="Heiti TC"/>
-          <w:b/>
-          <w:i w:val="0"/>
-          <w:color w:val="0B2545"/>
-          <w:sz w:val="23"/>
-        </w:rPr>
-        <w:t>6. 2026-08-09 压力测试：若9月16日美联储加息，中国央行政策空间与人民币应对</w:t>
-      </w:r>
-    </w:p>
-    <w:p>
-      <w:pPr>
-        <w:spacing w:before="0" w:after="40" w:line="264" w:lineRule="auto"/>
-      </w:pPr>
-      <w:r>
-        <w:rPr>
-          <w:rFonts w:ascii="Calibri" w:hAnsi="Calibri" w:eastAsia="Heiti TC"/>
-          <w:b w:val="0"/>
-          <w:i w:val="0"/>
-          <w:color w:val="667085"/>
-          <w:sz w:val="17"/>
-        </w:rPr>
-        <w:t>未识别 · 宏观通胀传导 · score 42.1</w:t>
-      </w:r>
-    </w:p>
-    <w:p>
-      <w:pPr>
-        <w:spacing w:before="0" w:after="100" w:line="264" w:lineRule="auto"/>
-      </w:pPr>
-      <w:r>
-        <w:rPr>
-          <w:rFonts w:ascii="Calibri" w:hAnsi="Calibri" w:eastAsia="Heiti TC"/>
-          <w:b w:val="0"/>
-          <w:i w:val="0"/>
-          <w:color w:val="334155"/>
-          <w:sz w:val="20"/>
-        </w:rPr>
-        <w:t>2026-08-09 压力测试：若9月16日美联储加息，中国央行政策空间与人民币应对</w:t>
-      </w:r>
-    </w:p>
-    <w:p>
-      <w:pPr>
-        <w:spacing w:before="0" w:after="160" w:line="264" w:lineRule="auto"/>
-      </w:pPr>
-      <w:r>
-        <w:rPr>
-          <w:rFonts w:ascii="Calibri" w:hAnsi="Calibri" w:eastAsia="Heiti TC"/>
-          <w:b w:val="0"/>
-          <w:i w:val="0"/>
-          <w:color w:val="667085"/>
-          <w:sz w:val="17"/>
-        </w:rPr>
-        <w:t xml:space="preserve">Report: </w:t>
-      </w:r>
-      <w:hyperlink r:id="rId23">
-        <w:r>
-          <w:rPr>
-            <w:color w:val="285B9D"/>
-            <w:u w:val="single"/>
-            <w:rFonts w:eastAsia="Heiti TC" w:ascii="Calibri" w:hAnsi="Calibri"/>
-          </w:rPr>
-          <w:t>reports/archive-587adbd2cd19</w:t>
+          <w:t>reports/archive-e608616ed57d</w:t>
         </w:r>
       </w:hyperlink>
     </w:p>
@@ -1115,7 +1115,62 @@
       </w:pPr>
       <w:r>
         <w:rPr>
-          <w:rFonts w:ascii="Calibri" w:hAnsi="Calibri" w:eastAsia="Heiti TC"/>
+          <w:rFonts w:ascii="Calibri" w:hAnsi="Calibri" w:eastAsia="Hiragino Sans GB"/>
+          <w:b/>
+          <w:i w:val="0"/>
+          <w:color w:val="0B2545"/>
+          <w:sz w:val="22"/>
+        </w:rPr>
+        <w:t>research discussion Session Brief</w:t>
+      </w:r>
+    </w:p>
+    <w:p>
+      <w:pPr>
+        <w:spacing w:before="0" w:after="60" w:line="264" w:lineRule="auto"/>
+      </w:pPr>
+      <w:r>
+        <w:rPr>
+          <w:rFonts w:ascii="Calibri" w:hAnsi="Calibri" w:eastAsia="Hiragino Sans GB"/>
+          <w:b w:val="0"/>
+          <w:i w:val="0"/>
+          <w:color w:val="334155"/>
+          <w:sz w:val="20"/>
+        </w:rPr>
+        <w:t>AI 基础设施，影响 5 / 概率 4</w:t>
+      </w:r>
+    </w:p>
+    <w:p>
+      <w:pPr>
+        <w:spacing w:before="0" w:after="160" w:line="264" w:lineRule="auto"/>
+      </w:pPr>
+      <w:r>
+        <w:rPr>
+          <w:rFonts w:ascii="Calibri" w:hAnsi="Calibri" w:eastAsia="Hiragino Sans GB"/>
+          <w:b w:val="0"/>
+          <w:i w:val="0"/>
+          <w:color w:val="667085"/>
+          <w:sz w:val="17"/>
+        </w:rPr>
+        <w:t xml:space="preserve">Report: </w:t>
+      </w:r>
+      <w:hyperlink r:id="rId12">
+        <w:r>
+          <w:rPr>
+            <w:color w:val="285B9D"/>
+            <w:u w:val="single"/>
+            <w:rFonts w:eastAsia="Hiragino Sans GB" w:ascii="Calibri" w:hAnsi="Calibri"/>
+          </w:rPr>
+          <w:t>reports/archive-d7796555327c</w:t>
+        </w:r>
+      </w:hyperlink>
+    </w:p>
+    <w:p>
+      <w:pPr>
+        <w:spacing w:before="0" w:after="40" w:line="264" w:lineRule="auto"/>
+      </w:pPr>
+      <w:r>
+        <w:rPr>
+          <w:rFonts w:ascii="Calibri" w:hAnsi="Calibri" w:eastAsia="Hiragino Sans GB"/>
           <w:b/>
           <w:i w:val="0"/>
           <w:color w:val="0B2545"/>
@@ -1130,7 +1185,7 @@
       </w:pPr>
       <w:r>
         <w:rPr>
-          <w:rFonts w:ascii="Calibri" w:hAnsi="Calibri" w:eastAsia="Heiti TC"/>
+          <w:rFonts w:ascii="Calibri" w:hAnsi="Calibri" w:eastAsia="Hiragino Sans GB"/>
           <w:b w:val="0"/>
           <w:i w:val="0"/>
           <w:color w:val="334155"/>
@@ -1145,7 +1200,7 @@
       </w:pPr>
       <w:r>
         <w:rPr>
-          <w:rFonts w:ascii="Calibri" w:hAnsi="Calibri" w:eastAsia="Heiti TC"/>
+          <w:rFonts w:ascii="Calibri" w:hAnsi="Calibri" w:eastAsia="Hiragino Sans GB"/>
           <w:b w:val="0"/>
           <w:i w:val="0"/>
           <w:color w:val="667085"/>
@@ -1153,12 +1208,12 @@
         </w:rPr>
         <w:t xml:space="preserve">Report: </w:t>
       </w:r>
-      <w:hyperlink r:id="rId13">
+      <w:hyperlink r:id="rId23">
         <w:r>
           <w:rPr>
             <w:color w:val="285B9D"/>
             <w:u w:val="single"/>
-            <w:rFonts w:eastAsia="Heiti TC" w:ascii="Calibri" w:hAnsi="Calibri"/>
+            <w:rFonts w:eastAsia="Hiragino Sans GB" w:ascii="Calibri" w:hAnsi="Calibri"/>
           </w:rPr>
           <w:t>reports/archive-959d0a1ef2ce</w:t>
         </w:r>
@@ -1170,7 +1225,7 @@
       </w:pPr>
       <w:r>
         <w:rPr>
-          <w:rFonts w:ascii="Calibri" w:hAnsi="Calibri" w:eastAsia="Heiti TC"/>
+          <w:rFonts w:ascii="Calibri" w:hAnsi="Calibri" w:eastAsia="Hiragino Sans GB"/>
           <w:b/>
           <w:i w:val="0"/>
           <w:color w:val="0B2545"/>
@@ -1185,7 +1240,7 @@
       </w:pPr>
       <w:r>
         <w:rPr>
-          <w:rFonts w:ascii="Calibri" w:hAnsi="Calibri" w:eastAsia="Heiti TC"/>
+          <w:rFonts w:ascii="Calibri" w:hAnsi="Calibri" w:eastAsia="Hiragino Sans GB"/>
           <w:b w:val="0"/>
           <w:i w:val="0"/>
           <w:color w:val="334155"/>
@@ -1200,7 +1255,7 @@
       </w:pPr>
       <w:r>
         <w:rPr>
-          <w:rFonts w:ascii="Calibri" w:hAnsi="Calibri" w:eastAsia="Heiti TC"/>
+          <w:rFonts w:ascii="Calibri" w:hAnsi="Calibri" w:eastAsia="Hiragino Sans GB"/>
           <w:b w:val="0"/>
           <w:i w:val="0"/>
           <w:color w:val="667085"/>
@@ -1213,64 +1268,9 @@
           <w:rPr>
             <w:color w:val="285B9D"/>
             <w:u w:val="single"/>
-            <w:rFonts w:eastAsia="Heiti TC" w:ascii="Calibri" w:hAnsi="Calibri"/>
+            <w:rFonts w:eastAsia="Hiragino Sans GB" w:ascii="Calibri" w:hAnsi="Calibri"/>
           </w:rPr>
           <w:t>reports/archive-0ca16e22b75f</w:t>
-        </w:r>
-      </w:hyperlink>
-    </w:p>
-    <w:p>
-      <w:pPr>
-        <w:spacing w:before="0" w:after="40" w:line="264" w:lineRule="auto"/>
-      </w:pPr>
-      <w:r>
-        <w:rPr>
-          <w:rFonts w:ascii="Calibri" w:hAnsi="Calibri" w:eastAsia="Heiti TC"/>
-          <w:b/>
-          <w:i w:val="0"/>
-          <w:color w:val="0B2545"/>
-          <w:sz w:val="22"/>
-        </w:rPr>
-        <w:t>边缘AI芯片供应链与工业自动化竞争格局 - 2026-08-07</w:t>
-      </w:r>
-    </w:p>
-    <w:p>
-      <w:pPr>
-        <w:spacing w:before="0" w:after="60" w:line="264" w:lineRule="auto"/>
-      </w:pPr>
-      <w:r>
-        <w:rPr>
-          <w:rFonts w:ascii="Calibri" w:hAnsi="Calibri" w:eastAsia="Heiti TC"/>
-          <w:b w:val="0"/>
-          <w:i w:val="0"/>
-          <w:color w:val="334155"/>
-          <w:sz w:val="20"/>
-        </w:rPr>
-        <w:t>AI 基础设施，影响 5 / 概率 4</w:t>
-      </w:r>
-    </w:p>
-    <w:p>
-      <w:pPr>
-        <w:spacing w:before="0" w:after="160" w:line="264" w:lineRule="auto"/>
-      </w:pPr>
-      <w:r>
-        <w:rPr>
-          <w:rFonts w:ascii="Calibri" w:hAnsi="Calibri" w:eastAsia="Heiti TC"/>
-          <w:b w:val="0"/>
-          <w:i w:val="0"/>
-          <w:color w:val="667085"/>
-          <w:sz w:val="17"/>
-        </w:rPr>
-        <w:t xml:space="preserve">Report: </w:t>
-      </w:r>
-      <w:hyperlink r:id="rId25">
-        <w:r>
-          <w:rPr>
-            <w:color w:val="285B9D"/>
-            <w:u w:val="single"/>
-            <w:rFonts w:eastAsia="Heiti TC" w:ascii="Calibri" w:hAnsi="Calibri"/>
-          </w:rPr>
-          <w:t>reports/archive-8ccc817d3859</w:t>
         </w:r>
       </w:hyperlink>
     </w:p>
@@ -1311,7 +1311,7 @@
             <w:r/>
             <w:r>
               <w:rPr>
-                <w:rFonts w:ascii="Calibri" w:hAnsi="Calibri" w:eastAsia="Heiti TC"/>
+                <w:rFonts w:ascii="Calibri" w:hAnsi="Calibri" w:eastAsia="Hiragino Sans GB"/>
                 <w:b/>
                 <w:color w:val="475569"/>
                 <w:sz w:val="18"/>
@@ -1334,7 +1334,7 @@
             <w:r/>
             <w:r>
               <w:rPr>
-                <w:rFonts w:ascii="Calibri" w:hAnsi="Calibri" w:eastAsia="Heiti TC"/>
+                <w:rFonts w:ascii="Calibri" w:hAnsi="Calibri" w:eastAsia="Hiragino Sans GB"/>
                 <w:b/>
                 <w:color w:val="475569"/>
                 <w:sz w:val="18"/>
@@ -1357,7 +1357,7 @@
             <w:r/>
             <w:r>
               <w:rPr>
-                <w:rFonts w:ascii="Calibri" w:hAnsi="Calibri" w:eastAsia="Heiti TC"/>
+                <w:rFonts w:ascii="Calibri" w:hAnsi="Calibri" w:eastAsia="Hiragino Sans GB"/>
                 <w:b/>
                 <w:color w:val="475569"/>
                 <w:sz w:val="18"/>
@@ -1380,7 +1380,7 @@
             <w:r/>
             <w:r>
               <w:rPr>
-                <w:rFonts w:ascii="Calibri" w:hAnsi="Calibri" w:eastAsia="Heiti TC"/>
+                <w:rFonts w:ascii="Calibri" w:hAnsi="Calibri" w:eastAsia="Hiragino Sans GB"/>
                 <w:b/>
                 <w:color w:val="475569"/>
                 <w:sz w:val="18"/>
@@ -1403,7 +1403,7 @@
             <w:r/>
             <w:r>
               <w:rPr>
-                <w:rFonts w:ascii="Calibri" w:hAnsi="Calibri" w:eastAsia="Heiti TC"/>
+                <w:rFonts w:ascii="Calibri" w:hAnsi="Calibri" w:eastAsia="Hiragino Sans GB"/>
                 <w:b/>
                 <w:color w:val="475569"/>
                 <w:sz w:val="18"/>
@@ -1426,12 +1426,12 @@
             <w:r/>
             <w:r>
               <w:rPr>
-                <w:rFonts w:ascii="Calibri" w:hAnsi="Calibri" w:eastAsia="Heiti TC"/>
+                <w:rFonts w:ascii="Calibri" w:hAnsi="Calibri" w:eastAsia="Hiragino Sans GB"/>
                 <w:b w:val="0"/>
                 <w:color w:val="111827"/>
                 <w:sz w:val="17"/>
               </w:rPr>
-              <w:t>工业制造周报研究</w:t>
+              <w:t>research discussion Session Brief</w:t>
             </w:r>
           </w:p>
         </w:tc>
@@ -1447,7 +1447,7 @@
             <w:r/>
             <w:r>
               <w:rPr>
-                <w:rFonts w:ascii="Calibri" w:hAnsi="Calibri" w:eastAsia="Heiti TC"/>
+                <w:rFonts w:ascii="Calibri" w:hAnsi="Calibri" w:eastAsia="Hiragino Sans GB"/>
                 <w:b w:val="0"/>
                 <w:color w:val="111827"/>
                 <w:sz w:val="16"/>
@@ -1468,12 +1468,12 @@
             <w:r/>
             <w:r>
               <w:rPr>
-                <w:rFonts w:ascii="Calibri" w:hAnsi="Calibri" w:eastAsia="Heiti TC"/>
+                <w:rFonts w:ascii="Calibri" w:hAnsi="Calibri" w:eastAsia="Hiragino Sans GB"/>
                 <w:b w:val="0"/>
                 <w:color w:val="111827"/>
                 <w:sz w:val="16"/>
               </w:rPr>
-              <w:t>宏观通胀传导</w:t>
+              <w:t>AI 基础设施</w:t>
             </w:r>
           </w:p>
         </w:tc>
@@ -1490,12 +1490,12 @@
             <w:r/>
             <w:r>
               <w:rPr>
-                <w:rFonts w:ascii="Calibri" w:hAnsi="Calibri" w:eastAsia="Heiti TC"/>
+                <w:rFonts w:ascii="Calibri" w:hAnsi="Calibri" w:eastAsia="Hiragino Sans GB"/>
                 <w:b/>
                 <w:color w:val="111827"/>
                 <w:sz w:val="17"/>
               </w:rPr>
-              <w:t>43.0</w:t>
+              <w:t>58.6</w:t>
             </w:r>
           </w:p>
         </w:tc>
@@ -1512,7 +1512,225 @@
             <w:r/>
             <w:r>
               <w:rPr>
-                <w:rFonts w:ascii="Calibri" w:hAnsi="Calibri" w:eastAsia="Heiti TC"/>
+                <w:rFonts w:ascii="Calibri" w:hAnsi="Calibri" w:eastAsia="Hiragino Sans GB"/>
+                <w:b w:val="0"/>
+                <w:color w:val="111827"/>
+                <w:sz w:val="16"/>
+              </w:rPr>
+              <w:t>风险 2</w:t>
+            </w:r>
+          </w:p>
+        </w:tc>
+      </w:tr>
+      <w:tr>
+        <w:tc>
+          <w:tcPr>
+            <w:tcW w:type="dxa" w:w="3720"/>
+            <w:vAlign w:val="center"/>
+          </w:tcPr>
+          <w:p>
+            <w:pPr>
+              <w:spacing w:before="0" w:after="0"/>
+            </w:pPr>
+            <w:r/>
+            <w:r>
+              <w:rPr>
+                <w:rFonts w:ascii="Calibri" w:hAnsi="Calibri" w:eastAsia="Hiragino Sans GB"/>
+                <w:b w:val="0"/>
+                <w:color w:val="111827"/>
+                <w:sz w:val="17"/>
+              </w:rPr>
+              <w:t>GOES供给：Cleveland-Cliffs之外的扩产能否打破变压器瓶颈？</w:t>
+            </w:r>
+          </w:p>
+        </w:tc>
+        <w:tc>
+          <w:tcPr>
+            <w:tcW w:type="dxa" w:w="1560"/>
+            <w:vAlign w:val="center"/>
+          </w:tcPr>
+          <w:p>
+            <w:pPr>
+              <w:spacing w:before="0" w:after="0"/>
+            </w:pPr>
+            <w:r/>
+            <w:r>
+              <w:rPr>
+                <w:rFonts w:ascii="Calibri" w:hAnsi="Calibri" w:eastAsia="Hiragino Sans GB"/>
+                <w:b w:val="0"/>
+                <w:color w:val="111827"/>
+                <w:sz w:val="16"/>
+              </w:rPr>
+              <w:t>未识别</w:t>
+            </w:r>
+          </w:p>
+        </w:tc>
+        <w:tc>
+          <w:tcPr>
+            <w:tcW w:type="dxa" w:w="1680"/>
+            <w:vAlign w:val="center"/>
+          </w:tcPr>
+          <w:p>
+            <w:pPr>
+              <w:spacing w:before="0" w:after="0"/>
+            </w:pPr>
+            <w:r/>
+            <w:r>
+              <w:rPr>
+                <w:rFonts w:ascii="Calibri" w:hAnsi="Calibri" w:eastAsia="Hiragino Sans GB"/>
+                <w:b w:val="0"/>
+                <w:color w:val="111827"/>
+                <w:sz w:val="16"/>
+              </w:rPr>
+              <w:t>工业供给瓶颈</w:t>
+            </w:r>
+          </w:p>
+        </w:tc>
+        <w:tc>
+          <w:tcPr>
+            <w:tcW w:type="dxa" w:w="900"/>
+            <w:vAlign w:val="center"/>
+          </w:tcPr>
+          <w:p>
+            <w:pPr>
+              <w:spacing w:before="0" w:after="0"/>
+              <w:jc w:val="center"/>
+            </w:pPr>
+            <w:r/>
+            <w:r>
+              <w:rPr>
+                <w:rFonts w:ascii="Calibri" w:hAnsi="Calibri" w:eastAsia="Hiragino Sans GB"/>
+                <w:b/>
+                <w:color w:val="111827"/>
+                <w:sz w:val="17"/>
+              </w:rPr>
+              <w:t>52.8</w:t>
+            </w:r>
+          </w:p>
+        </w:tc>
+        <w:tc>
+          <w:tcPr>
+            <w:tcW w:type="dxa" w:w="1500"/>
+            <w:vAlign w:val="center"/>
+          </w:tcPr>
+          <w:p>
+            <w:pPr>
+              <w:spacing w:before="0" w:after="0"/>
+              <w:jc w:val="center"/>
+            </w:pPr>
+            <w:r/>
+            <w:r>
+              <w:rPr>
+                <w:rFonts w:ascii="Calibri" w:hAnsi="Calibri" w:eastAsia="Hiragino Sans GB"/>
+                <w:b w:val="0"/>
+                <w:color w:val="111827"/>
+                <w:sz w:val="16"/>
+              </w:rPr>
+              <w:t>风险 2</w:t>
+            </w:r>
+          </w:p>
+        </w:tc>
+      </w:tr>
+      <w:tr>
+        <w:tc>
+          <w:tcPr>
+            <w:tcW w:type="dxa" w:w="3720"/>
+            <w:vAlign w:val="center"/>
+          </w:tcPr>
+          <w:p>
+            <w:pPr>
+              <w:spacing w:before="0" w:after="0"/>
+            </w:pPr>
+            <w:r/>
+            <w:r>
+              <w:rPr>
+                <w:rFonts w:ascii="Calibri" w:hAnsi="Calibri" w:eastAsia="Hiragino Sans GB"/>
+                <w:b w:val="0"/>
+                <w:color w:val="111827"/>
+                <w:sz w:val="17"/>
+              </w:rPr>
+              <w:t>GOES约束下的变压器交付曲线：哪些已公告AI数据中心MW最可能送电延期，以及如何量化ROIC与估值折价</w:t>
+            </w:r>
+          </w:p>
+        </w:tc>
+        <w:tc>
+          <w:tcPr>
+            <w:tcW w:type="dxa" w:w="1560"/>
+            <w:vAlign w:val="center"/>
+          </w:tcPr>
+          <w:p>
+            <w:pPr>
+              <w:spacing w:before="0" w:after="0"/>
+            </w:pPr>
+            <w:r/>
+            <w:r>
+              <w:rPr>
+                <w:rFonts w:ascii="Calibri" w:hAnsi="Calibri" w:eastAsia="Hiragino Sans GB"/>
+                <w:b w:val="0"/>
+                <w:color w:val="111827"/>
+                <w:sz w:val="16"/>
+              </w:rPr>
+              <w:t>未识别</w:t>
+            </w:r>
+          </w:p>
+        </w:tc>
+        <w:tc>
+          <w:tcPr>
+            <w:tcW w:type="dxa" w:w="1680"/>
+            <w:vAlign w:val="center"/>
+          </w:tcPr>
+          <w:p>
+            <w:pPr>
+              <w:spacing w:before="0" w:after="0"/>
+            </w:pPr>
+            <w:r/>
+            <w:r>
+              <w:rPr>
+                <w:rFonts w:ascii="Calibri" w:hAnsi="Calibri" w:eastAsia="Hiragino Sans GB"/>
+                <w:b w:val="0"/>
+                <w:color w:val="111827"/>
+                <w:sz w:val="16"/>
+              </w:rPr>
+              <w:t>工业供给瓶颈</w:t>
+            </w:r>
+          </w:p>
+        </w:tc>
+        <w:tc>
+          <w:tcPr>
+            <w:tcW w:type="dxa" w:w="900"/>
+            <w:vAlign w:val="center"/>
+          </w:tcPr>
+          <w:p>
+            <w:pPr>
+              <w:spacing w:before="0" w:after="0"/>
+              <w:jc w:val="center"/>
+            </w:pPr>
+            <w:r/>
+            <w:r>
+              <w:rPr>
+                <w:rFonts w:ascii="Calibri" w:hAnsi="Calibri" w:eastAsia="Hiragino Sans GB"/>
+                <w:b/>
+                <w:color w:val="111827"/>
+                <w:sz w:val="17"/>
+              </w:rPr>
+              <w:t>47.7</w:t>
+            </w:r>
+          </w:p>
+        </w:tc>
+        <w:tc>
+          <w:tcPr>
+            <w:tcW w:type="dxa" w:w="1500"/>
+            <w:vAlign w:val="center"/>
+          </w:tcPr>
+          <w:p>
+            <w:pPr>
+              <w:spacing w:before="0" w:after="0"/>
+              <w:jc w:val="center"/>
+            </w:pPr>
+            <w:r/>
+            <w:r>
+              <w:rPr>
+                <w:rFonts w:ascii="Calibri" w:hAnsi="Calibri" w:eastAsia="Hiragino Sans GB"/>
                 <w:b w:val="0"/>
                 <w:color w:val="111827"/>
                 <w:sz w:val="16"/>
@@ -1535,12 +1753,12 @@
             <w:r/>
             <w:r>
               <w:rPr>
-                <w:rFonts w:ascii="Calibri" w:hAnsi="Calibri" w:eastAsia="Heiti TC"/>
+                <w:rFonts w:ascii="Calibri" w:hAnsi="Calibri" w:eastAsia="Hiragino Sans GB"/>
                 <w:b w:val="0"/>
                 <w:color w:val="111827"/>
                 <w:sz w:val="17"/>
               </w:rPr>
-              <w:t>研究记录 — 人民币汇率阈值与中国政策对冲空间</w:t>
+              <w:t>AI 算力交付瓶颈：从 GPU 稀缺到 Time-to-Power，2026-08-09</w:t>
             </w:r>
           </w:p>
         </w:tc>
@@ -1556,7 +1774,7 @@
             <w:r/>
             <w:r>
               <w:rPr>
-                <w:rFonts w:ascii="Calibri" w:hAnsi="Calibri" w:eastAsia="Heiti TC"/>
+                <w:rFonts w:ascii="Calibri" w:hAnsi="Calibri" w:eastAsia="Hiragino Sans GB"/>
                 <w:b w:val="0"/>
                 <w:color w:val="111827"/>
                 <w:sz w:val="16"/>
@@ -1577,12 +1795,12 @@
             <w:r/>
             <w:r>
               <w:rPr>
-                <w:rFonts w:ascii="Calibri" w:hAnsi="Calibri" w:eastAsia="Heiti TC"/>
+                <w:rFonts w:ascii="Calibri" w:hAnsi="Calibri" w:eastAsia="Hiragino Sans GB"/>
                 <w:b w:val="0"/>
                 <w:color w:val="111827"/>
                 <w:sz w:val="16"/>
               </w:rPr>
-              <w:t>宏观通胀传导</w:t>
+              <w:t>AI 基础设施</w:t>
             </w:r>
           </w:p>
         </w:tc>
@@ -1599,12 +1817,12 @@
             <w:r/>
             <w:r>
               <w:rPr>
-                <w:rFonts w:ascii="Calibri" w:hAnsi="Calibri" w:eastAsia="Heiti TC"/>
+                <w:rFonts w:ascii="Calibri" w:hAnsi="Calibri" w:eastAsia="Hiragino Sans GB"/>
                 <w:b/>
                 <w:color w:val="111827"/>
                 <w:sz w:val="17"/>
               </w:rPr>
-              <w:t>42.7</w:t>
+              <w:t>47.6</w:t>
             </w:r>
           </w:p>
         </w:tc>
@@ -1621,7 +1839,552 @@
             <w:r/>
             <w:r>
               <w:rPr>
-                <w:rFonts w:ascii="Calibri" w:hAnsi="Calibri" w:eastAsia="Heiti TC"/>
+                <w:rFonts w:ascii="Calibri" w:hAnsi="Calibri" w:eastAsia="Hiragino Sans GB"/>
+                <w:b w:val="0"/>
+                <w:color w:val="111827"/>
+                <w:sz w:val="16"/>
+              </w:rPr>
+              <w:t>风险 2</w:t>
+            </w:r>
+          </w:p>
+        </w:tc>
+      </w:tr>
+      <w:tr>
+        <w:tc>
+          <w:tcPr>
+            <w:tcW w:type="dxa" w:w="3720"/>
+            <w:vAlign w:val="center"/>
+          </w:tcPr>
+          <w:p>
+            <w:pPr>
+              <w:spacing w:before="0" w:after="0"/>
+            </w:pPr>
+            <w:r/>
+            <w:r>
+              <w:rPr>
+                <w:rFonts w:ascii="Calibri" w:hAnsi="Calibri" w:eastAsia="Hiragino Sans GB"/>
+                <w:b w:val="0"/>
+                <w:color w:val="111827"/>
+                <w:sz w:val="17"/>
+              </w:rPr>
+              <w:t>AI数据中心物理瓶颈可投资排序，2026-08-09</w:t>
+            </w:r>
+          </w:p>
+        </w:tc>
+        <w:tc>
+          <w:tcPr>
+            <w:tcW w:type="dxa" w:w="1560"/>
+            <w:vAlign w:val="center"/>
+          </w:tcPr>
+          <w:p>
+            <w:pPr>
+              <w:spacing w:before="0" w:after="0"/>
+            </w:pPr>
+            <w:r/>
+            <w:r>
+              <w:rPr>
+                <w:rFonts w:ascii="Calibri" w:hAnsi="Calibri" w:eastAsia="Hiragino Sans GB"/>
+                <w:b w:val="0"/>
+                <w:color w:val="111827"/>
+                <w:sz w:val="16"/>
+              </w:rPr>
+              <w:t>未识别</w:t>
+            </w:r>
+          </w:p>
+        </w:tc>
+        <w:tc>
+          <w:tcPr>
+            <w:tcW w:type="dxa" w:w="1680"/>
+            <w:vAlign w:val="center"/>
+          </w:tcPr>
+          <w:p>
+            <w:pPr>
+              <w:spacing w:before="0" w:after="0"/>
+            </w:pPr>
+            <w:r/>
+            <w:r>
+              <w:rPr>
+                <w:rFonts w:ascii="Calibri" w:hAnsi="Calibri" w:eastAsia="Hiragino Sans GB"/>
+                <w:b w:val="0"/>
+                <w:color w:val="111827"/>
+                <w:sz w:val="16"/>
+              </w:rPr>
+              <w:t>AI 基础设施</w:t>
+            </w:r>
+          </w:p>
+        </w:tc>
+        <w:tc>
+          <w:tcPr>
+            <w:tcW w:type="dxa" w:w="900"/>
+            <w:vAlign w:val="center"/>
+          </w:tcPr>
+          <w:p>
+            <w:pPr>
+              <w:spacing w:before="0" w:after="0"/>
+              <w:jc w:val="center"/>
+            </w:pPr>
+            <w:r/>
+            <w:r>
+              <w:rPr>
+                <w:rFonts w:ascii="Calibri" w:hAnsi="Calibri" w:eastAsia="Hiragino Sans GB"/>
+                <w:b/>
+                <w:color w:val="111827"/>
+                <w:sz w:val="17"/>
+              </w:rPr>
+              <w:t>47.4</w:t>
+            </w:r>
+          </w:p>
+        </w:tc>
+        <w:tc>
+          <w:tcPr>
+            <w:tcW w:type="dxa" w:w="1500"/>
+            <w:vAlign w:val="center"/>
+          </w:tcPr>
+          <w:p>
+            <w:pPr>
+              <w:spacing w:before="0" w:after="0"/>
+              <w:jc w:val="center"/>
+            </w:pPr>
+            <w:r/>
+            <w:r>
+              <w:rPr>
+                <w:rFonts w:ascii="Calibri" w:hAnsi="Calibri" w:eastAsia="Hiragino Sans GB"/>
+                <w:b w:val="0"/>
+                <w:color w:val="111827"/>
+                <w:sz w:val="16"/>
+              </w:rPr>
+              <w:t>风险 2</w:t>
+            </w:r>
+          </w:p>
+        </w:tc>
+      </w:tr>
+      <w:tr>
+        <w:tc>
+          <w:tcPr>
+            <w:tcW w:type="dxa" w:w="3720"/>
+            <w:vAlign w:val="center"/>
+          </w:tcPr>
+          <w:p>
+            <w:pPr>
+              <w:spacing w:before="0" w:after="0"/>
+            </w:pPr>
+            <w:r/>
+            <w:r>
+              <w:rPr>
+                <w:rFonts w:ascii="Calibri" w:hAnsi="Calibri" w:eastAsia="Hiragino Sans GB"/>
+                <w:b w:val="0"/>
+                <w:color w:val="111827"/>
+                <w:sz w:val="17"/>
+              </w:rPr>
+              <w:t>prior research notes— 电网设备制造商：产能扩张周期与订单质量</w:t>
+            </w:r>
+          </w:p>
+        </w:tc>
+        <w:tc>
+          <w:tcPr>
+            <w:tcW w:type="dxa" w:w="1560"/>
+            <w:vAlign w:val="center"/>
+          </w:tcPr>
+          <w:p>
+            <w:pPr>
+              <w:spacing w:before="0" w:after="0"/>
+            </w:pPr>
+            <w:r/>
+            <w:r>
+              <w:rPr>
+                <w:rFonts w:ascii="Calibri" w:hAnsi="Calibri" w:eastAsia="Hiragino Sans GB"/>
+                <w:b w:val="0"/>
+                <w:color w:val="111827"/>
+                <w:sz w:val="16"/>
+              </w:rPr>
+              <w:t>未识别</w:t>
+            </w:r>
+          </w:p>
+        </w:tc>
+        <w:tc>
+          <w:tcPr>
+            <w:tcW w:type="dxa" w:w="1680"/>
+            <w:vAlign w:val="center"/>
+          </w:tcPr>
+          <w:p>
+            <w:pPr>
+              <w:spacing w:before="0" w:after="0"/>
+            </w:pPr>
+            <w:r/>
+            <w:r>
+              <w:rPr>
+                <w:rFonts w:ascii="Calibri" w:hAnsi="Calibri" w:eastAsia="Hiragino Sans GB"/>
+                <w:b w:val="0"/>
+                <w:color w:val="111827"/>
+                <w:sz w:val="16"/>
+              </w:rPr>
+              <w:t>工业供给瓶颈</w:t>
+            </w:r>
+          </w:p>
+        </w:tc>
+        <w:tc>
+          <w:tcPr>
+            <w:tcW w:type="dxa" w:w="900"/>
+            <w:vAlign w:val="center"/>
+          </w:tcPr>
+          <w:p>
+            <w:pPr>
+              <w:spacing w:before="0" w:after="0"/>
+              <w:jc w:val="center"/>
+            </w:pPr>
+            <w:r/>
+            <w:r>
+              <w:rPr>
+                <w:rFonts w:ascii="Calibri" w:hAnsi="Calibri" w:eastAsia="Hiragino Sans GB"/>
+                <w:b/>
+                <w:color w:val="111827"/>
+                <w:sz w:val="17"/>
+              </w:rPr>
+              <w:t>46.3</w:t>
+            </w:r>
+          </w:p>
+        </w:tc>
+        <w:tc>
+          <w:tcPr>
+            <w:tcW w:type="dxa" w:w="1500"/>
+            <w:vAlign w:val="center"/>
+          </w:tcPr>
+          <w:p>
+            <w:pPr>
+              <w:spacing w:before="0" w:after="0"/>
+              <w:jc w:val="center"/>
+            </w:pPr>
+            <w:r/>
+            <w:r>
+              <w:rPr>
+                <w:rFonts w:ascii="Calibri" w:hAnsi="Calibri" w:eastAsia="Hiragino Sans GB"/>
+                <w:b w:val="0"/>
+                <w:color w:val="111827"/>
+                <w:sz w:val="16"/>
+              </w:rPr>
+              <w:t>常规</w:t>
+            </w:r>
+          </w:p>
+        </w:tc>
+      </w:tr>
+      <w:tr>
+        <w:tc>
+          <w:tcPr>
+            <w:tcW w:type="dxa" w:w="3720"/>
+            <w:vAlign w:val="center"/>
+          </w:tcPr>
+          <w:p>
+            <w:pPr>
+              <w:spacing w:before="0" w:after="0"/>
+            </w:pPr>
+            <w:r/>
+            <w:r>
+              <w:rPr>
+                <w:rFonts w:ascii="Calibri" w:hAnsi="Calibri" w:eastAsia="Hiragino Sans GB"/>
+                <w:b w:val="0"/>
+                <w:color w:val="111827"/>
+                <w:sz w:val="17"/>
+              </w:rPr>
+              <w:t>半导体材料设备压力桶的日度迁移监控与组合预警阈值落地</w:t>
+            </w:r>
+          </w:p>
+        </w:tc>
+        <w:tc>
+          <w:tcPr>
+            <w:tcW w:type="dxa" w:w="1560"/>
+            <w:vAlign w:val="center"/>
+          </w:tcPr>
+          <w:p>
+            <w:pPr>
+              <w:spacing w:before="0" w:after="0"/>
+            </w:pPr>
+            <w:r/>
+            <w:r>
+              <w:rPr>
+                <w:rFonts w:ascii="Calibri" w:hAnsi="Calibri" w:eastAsia="Hiragino Sans GB"/>
+                <w:b w:val="0"/>
+                <w:color w:val="111827"/>
+                <w:sz w:val="16"/>
+              </w:rPr>
+              <w:t>未识别</w:t>
+            </w:r>
+          </w:p>
+        </w:tc>
+        <w:tc>
+          <w:tcPr>
+            <w:tcW w:type="dxa" w:w="1680"/>
+            <w:vAlign w:val="center"/>
+          </w:tcPr>
+          <w:p>
+            <w:pPr>
+              <w:spacing w:before="0" w:after="0"/>
+            </w:pPr>
+            <w:r/>
+            <w:r>
+              <w:rPr>
+                <w:rFonts w:ascii="Calibri" w:hAnsi="Calibri" w:eastAsia="Hiragino Sans GB"/>
+                <w:b w:val="0"/>
+                <w:color w:val="111827"/>
+                <w:sz w:val="16"/>
+              </w:rPr>
+              <w:t>工业供给瓶颈</w:t>
+            </w:r>
+          </w:p>
+        </w:tc>
+        <w:tc>
+          <w:tcPr>
+            <w:tcW w:type="dxa" w:w="900"/>
+            <w:vAlign w:val="center"/>
+          </w:tcPr>
+          <w:p>
+            <w:pPr>
+              <w:spacing w:before="0" w:after="0"/>
+              <w:jc w:val="center"/>
+            </w:pPr>
+            <w:r/>
+            <w:r>
+              <w:rPr>
+                <w:rFonts w:ascii="Calibri" w:hAnsi="Calibri" w:eastAsia="Hiragino Sans GB"/>
+                <w:b/>
+                <w:color w:val="111827"/>
+                <w:sz w:val="17"/>
+              </w:rPr>
+              <w:t>44.2</w:t>
+            </w:r>
+          </w:p>
+        </w:tc>
+        <w:tc>
+          <w:tcPr>
+            <w:tcW w:type="dxa" w:w="1500"/>
+            <w:vAlign w:val="center"/>
+          </w:tcPr>
+          <w:p>
+            <w:pPr>
+              <w:spacing w:before="0" w:after="0"/>
+              <w:jc w:val="center"/>
+            </w:pPr>
+            <w:r/>
+            <w:r>
+              <w:rPr>
+                <w:rFonts w:ascii="Calibri" w:hAnsi="Calibri" w:eastAsia="Hiragino Sans GB"/>
+                <w:b w:val="0"/>
+                <w:color w:val="111827"/>
+                <w:sz w:val="16"/>
+              </w:rPr>
+              <w:t>风险 2</w:t>
+            </w:r>
+          </w:p>
+        </w:tc>
+      </w:tr>
+      <w:tr>
+        <w:tc>
+          <w:tcPr>
+            <w:tcW w:type="dxa" w:w="3720"/>
+            <w:vAlign w:val="center"/>
+          </w:tcPr>
+          <w:p>
+            <w:pPr>
+              <w:spacing w:before="0" w:after="0"/>
+            </w:pPr>
+            <w:r/>
+            <w:r>
+              <w:rPr>
+                <w:rFonts w:ascii="Calibri" w:hAnsi="Calibri" w:eastAsia="Hiragino Sans GB"/>
+                <w:b w:val="0"/>
+                <w:color w:val="111827"/>
+                <w:sz w:val="17"/>
+              </w:rPr>
+              <w:t>把100MW电力成本承销模型转化为A股IDC/算力运营商估值折价与组合权重（工作日期2026-08-09）</w:t>
+            </w:r>
+          </w:p>
+        </w:tc>
+        <w:tc>
+          <w:tcPr>
+            <w:tcW w:type="dxa" w:w="1560"/>
+            <w:vAlign w:val="center"/>
+          </w:tcPr>
+          <w:p>
+            <w:pPr>
+              <w:spacing w:before="0" w:after="0"/>
+            </w:pPr>
+            <w:r/>
+            <w:r>
+              <w:rPr>
+                <w:rFonts w:ascii="Calibri" w:hAnsi="Calibri" w:eastAsia="Hiragino Sans GB"/>
+                <w:b w:val="0"/>
+                <w:color w:val="111827"/>
+                <w:sz w:val="16"/>
+              </w:rPr>
+              <w:t>未识别</w:t>
+            </w:r>
+          </w:p>
+        </w:tc>
+        <w:tc>
+          <w:tcPr>
+            <w:tcW w:type="dxa" w:w="1680"/>
+            <w:vAlign w:val="center"/>
+          </w:tcPr>
+          <w:p>
+            <w:pPr>
+              <w:spacing w:before="0" w:after="0"/>
+            </w:pPr>
+            <w:r/>
+            <w:r>
+              <w:rPr>
+                <w:rFonts w:ascii="Calibri" w:hAnsi="Calibri" w:eastAsia="Hiragino Sans GB"/>
+                <w:b w:val="0"/>
+                <w:color w:val="111827"/>
+                <w:sz w:val="16"/>
+              </w:rPr>
+              <w:t>AI 基础设施</w:t>
+            </w:r>
+          </w:p>
+        </w:tc>
+        <w:tc>
+          <w:tcPr>
+            <w:tcW w:type="dxa" w:w="900"/>
+            <w:vAlign w:val="center"/>
+          </w:tcPr>
+          <w:p>
+            <w:pPr>
+              <w:spacing w:before="0" w:after="0"/>
+              <w:jc w:val="center"/>
+            </w:pPr>
+            <w:r/>
+            <w:r>
+              <w:rPr>
+                <w:rFonts w:ascii="Calibri" w:hAnsi="Calibri" w:eastAsia="Hiragino Sans GB"/>
+                <w:b/>
+                <w:color w:val="111827"/>
+                <w:sz w:val="17"/>
+              </w:rPr>
+              <w:t>43.3</w:t>
+            </w:r>
+          </w:p>
+        </w:tc>
+        <w:tc>
+          <w:tcPr>
+            <w:tcW w:type="dxa" w:w="1500"/>
+            <w:vAlign w:val="center"/>
+          </w:tcPr>
+          <w:p>
+            <w:pPr>
+              <w:spacing w:before="0" w:after="0"/>
+              <w:jc w:val="center"/>
+            </w:pPr>
+            <w:r/>
+            <w:r>
+              <w:rPr>
+                <w:rFonts w:ascii="Calibri" w:hAnsi="Calibri" w:eastAsia="Hiragino Sans GB"/>
+                <w:b w:val="0"/>
+                <w:color w:val="111827"/>
+                <w:sz w:val="16"/>
+              </w:rPr>
+              <w:t>常规</w:t>
+            </w:r>
+          </w:p>
+        </w:tc>
+      </w:tr>
+      <w:tr>
+        <w:tc>
+          <w:tcPr>
+            <w:tcW w:type="dxa" w:w="3720"/>
+            <w:vAlign w:val="center"/>
+          </w:tcPr>
+          <w:p>
+            <w:pPr>
+              <w:spacing w:before="0" w:after="0"/>
+            </w:pPr>
+            <w:r/>
+            <w:r>
+              <w:rPr>
+                <w:rFonts w:ascii="Calibri" w:hAnsi="Calibri" w:eastAsia="Hiragino Sans GB"/>
+                <w:b w:val="0"/>
+                <w:color w:val="111827"/>
+                <w:sz w:val="17"/>
+              </w:rPr>
+              <w:t>依赖电网并网型AI基础设施SPV/项目债务信用压力测试 — 工作日2026-08-09</w:t>
+            </w:r>
+          </w:p>
+        </w:tc>
+        <w:tc>
+          <w:tcPr>
+            <w:tcW w:type="dxa" w:w="1560"/>
+            <w:vAlign w:val="center"/>
+          </w:tcPr>
+          <w:p>
+            <w:pPr>
+              <w:spacing w:before="0" w:after="0"/>
+            </w:pPr>
+            <w:r/>
+            <w:r>
+              <w:rPr>
+                <w:rFonts w:ascii="Calibri" w:hAnsi="Calibri" w:eastAsia="Hiragino Sans GB"/>
+                <w:b w:val="0"/>
+                <w:color w:val="111827"/>
+                <w:sz w:val="16"/>
+              </w:rPr>
+              <w:t>未识别</w:t>
+            </w:r>
+          </w:p>
+        </w:tc>
+        <w:tc>
+          <w:tcPr>
+            <w:tcW w:type="dxa" w:w="1680"/>
+            <w:vAlign w:val="center"/>
+          </w:tcPr>
+          <w:p>
+            <w:pPr>
+              <w:spacing w:before="0" w:after="0"/>
+            </w:pPr>
+            <w:r/>
+            <w:r>
+              <w:rPr>
+                <w:rFonts w:ascii="Calibri" w:hAnsi="Calibri" w:eastAsia="Hiragino Sans GB"/>
+                <w:b w:val="0"/>
+                <w:color w:val="111827"/>
+                <w:sz w:val="16"/>
+              </w:rPr>
+              <w:t>电力与电网</w:t>
+            </w:r>
+          </w:p>
+        </w:tc>
+        <w:tc>
+          <w:tcPr>
+            <w:tcW w:type="dxa" w:w="900"/>
+            <w:vAlign w:val="center"/>
+          </w:tcPr>
+          <w:p>
+            <w:pPr>
+              <w:spacing w:before="0" w:after="0"/>
+              <w:jc w:val="center"/>
+            </w:pPr>
+            <w:r/>
+            <w:r>
+              <w:rPr>
+                <w:rFonts w:ascii="Calibri" w:hAnsi="Calibri" w:eastAsia="Hiragino Sans GB"/>
+                <w:b/>
+                <w:color w:val="111827"/>
+                <w:sz w:val="17"/>
+              </w:rPr>
+              <w:t>43.2</w:t>
+            </w:r>
+          </w:p>
+        </w:tc>
+        <w:tc>
+          <w:tcPr>
+            <w:tcW w:type="dxa" w:w="1500"/>
+            <w:vAlign w:val="center"/>
+          </w:tcPr>
+          <w:p>
+            <w:pPr>
+              <w:spacing w:before="0" w:after="0"/>
+              <w:jc w:val="center"/>
+            </w:pPr>
+            <w:r/>
+            <w:r>
+              <w:rPr>
+                <w:rFonts w:ascii="Calibri" w:hAnsi="Calibri" w:eastAsia="Hiragino Sans GB"/>
                 <w:b w:val="0"/>
                 <w:color w:val="111827"/>
                 <w:sz w:val="16"/>
@@ -1644,12 +2407,12 @@
             <w:r/>
             <w:r>
               <w:rPr>
-                <w:rFonts w:ascii="Calibri" w:hAnsi="Calibri" w:eastAsia="Heiti TC"/>
+                <w:rFonts w:ascii="Calibri" w:hAnsi="Calibri" w:eastAsia="Hiragino Sans GB"/>
                 <w:b w:val="0"/>
                 <w:color w:val="111827"/>
                 <w:sz w:val="17"/>
               </w:rPr>
-              <w:t>2026-08-09 美联储9月维持利率但保留鹰派指引下的跨资产配置</w:t>
+              <w:t>工业制造周报研究</w:t>
             </w:r>
           </w:p>
         </w:tc>
@@ -1665,7 +2428,7 @@
             <w:r/>
             <w:r>
               <w:rPr>
-                <w:rFonts w:ascii="Calibri" w:hAnsi="Calibri" w:eastAsia="Heiti TC"/>
+                <w:rFonts w:ascii="Calibri" w:hAnsi="Calibri" w:eastAsia="Hiragino Sans GB"/>
                 <w:b w:val="0"/>
                 <w:color w:val="111827"/>
                 <w:sz w:val="16"/>
@@ -1686,7 +2449,7 @@
             <w:r/>
             <w:r>
               <w:rPr>
-                <w:rFonts w:ascii="Calibri" w:hAnsi="Calibri" w:eastAsia="Heiti TC"/>
+                <w:rFonts w:ascii="Calibri" w:hAnsi="Calibri" w:eastAsia="Hiragino Sans GB"/>
                 <w:b w:val="0"/>
                 <w:color w:val="111827"/>
                 <w:sz w:val="16"/>
@@ -1708,12 +2471,12 @@
             <w:r/>
             <w:r>
               <w:rPr>
-                <w:rFonts w:ascii="Calibri" w:hAnsi="Calibri" w:eastAsia="Heiti TC"/>
+                <w:rFonts w:ascii="Calibri" w:hAnsi="Calibri" w:eastAsia="Hiragino Sans GB"/>
                 <w:b/>
                 <w:color w:val="111827"/>
                 <w:sz w:val="17"/>
               </w:rPr>
-              <w:t>42.7</w:t>
+              <w:t>43.0</w:t>
             </w:r>
           </w:p>
         </w:tc>
@@ -1730,7 +2493,7 @@
             <w:r/>
             <w:r>
               <w:rPr>
-                <w:rFonts w:ascii="Calibri" w:hAnsi="Calibri" w:eastAsia="Heiti TC"/>
+                <w:rFonts w:ascii="Calibri" w:hAnsi="Calibri" w:eastAsia="Hiragino Sans GB"/>
                 <w:b w:val="0"/>
                 <w:color w:val="111827"/>
                 <w:sz w:val="16"/>
@@ -1753,12 +2516,12 @@
             <w:r/>
             <w:r>
               <w:rPr>
-                <w:rFonts w:ascii="Calibri" w:hAnsi="Calibri" w:eastAsia="Heiti TC"/>
+                <w:rFonts w:ascii="Calibri" w:hAnsi="Calibri" w:eastAsia="Hiragino Sans GB"/>
                 <w:b w:val="0"/>
                 <w:color w:val="111827"/>
                 <w:sz w:val="17"/>
               </w:rPr>
-              <w:t>前序研究片 — 9月美联储加息压力测试下的人民币与央行政策空间</w:t>
+              <w:t>prior research notes— 谁真正把 AI 负荷变成利润：rate base、接入费与电力设备的利润池归属</w:t>
             </w:r>
           </w:p>
         </w:tc>
@@ -1774,7 +2537,7 @@
             <w:r/>
             <w:r>
               <w:rPr>
-                <w:rFonts w:ascii="Calibri" w:hAnsi="Calibri" w:eastAsia="Heiti TC"/>
+                <w:rFonts w:ascii="Calibri" w:hAnsi="Calibri" w:eastAsia="Hiragino Sans GB"/>
                 <w:b w:val="0"/>
                 <w:color w:val="111827"/>
                 <w:sz w:val="16"/>
@@ -1795,7 +2558,7 @@
             <w:r/>
             <w:r>
               <w:rPr>
-                <w:rFonts w:ascii="Calibri" w:hAnsi="Calibri" w:eastAsia="Heiti TC"/>
+                <w:rFonts w:ascii="Calibri" w:hAnsi="Calibri" w:eastAsia="Hiragino Sans GB"/>
                 <w:b w:val="0"/>
                 <w:color w:val="111827"/>
                 <w:sz w:val="16"/>
@@ -1817,7 +2580,334 @@
             <w:r/>
             <w:r>
               <w:rPr>
-                <w:rFonts w:ascii="Calibri" w:hAnsi="Calibri" w:eastAsia="Heiti TC"/>
+                <w:rFonts w:ascii="Calibri" w:hAnsi="Calibri" w:eastAsia="Hiragino Sans GB"/>
+                <w:b/>
+                <w:color w:val="111827"/>
+                <w:sz w:val="17"/>
+              </w:rPr>
+              <w:t>42.9</w:t>
+            </w:r>
+          </w:p>
+        </w:tc>
+        <w:tc>
+          <w:tcPr>
+            <w:tcW w:type="dxa" w:w="1500"/>
+            <w:vAlign w:val="center"/>
+          </w:tcPr>
+          <w:p>
+            <w:pPr>
+              <w:spacing w:before="0" w:after="0"/>
+              <w:jc w:val="center"/>
+            </w:pPr>
+            <w:r/>
+            <w:r>
+              <w:rPr>
+                <w:rFonts w:ascii="Calibri" w:hAnsi="Calibri" w:eastAsia="Hiragino Sans GB"/>
+                <w:b w:val="0"/>
+                <w:color w:val="111827"/>
+                <w:sz w:val="16"/>
+              </w:rPr>
+              <w:t>常规</w:t>
+            </w:r>
+          </w:p>
+        </w:tc>
+      </w:tr>
+      <w:tr>
+        <w:tc>
+          <w:tcPr>
+            <w:tcW w:type="dxa" w:w="3720"/>
+            <w:vAlign w:val="center"/>
+          </w:tcPr>
+          <w:p>
+            <w:pPr>
+              <w:spacing w:before="0" w:after="0"/>
+            </w:pPr>
+            <w:r/>
+            <w:r>
+              <w:rPr>
+                <w:rFonts w:ascii="Calibri" w:hAnsi="Calibri" w:eastAsia="Hiragino Sans GB"/>
+                <w:b w:val="0"/>
+                <w:color w:val="111827"/>
+                <w:sz w:val="17"/>
+              </w:rPr>
+              <w:t>研究记录 — 人民币汇率阈值与中国政策对冲空间</w:t>
+            </w:r>
+          </w:p>
+        </w:tc>
+        <w:tc>
+          <w:tcPr>
+            <w:tcW w:type="dxa" w:w="1560"/>
+            <w:vAlign w:val="center"/>
+          </w:tcPr>
+          <w:p>
+            <w:pPr>
+              <w:spacing w:before="0" w:after="0"/>
+            </w:pPr>
+            <w:r/>
+            <w:r>
+              <w:rPr>
+                <w:rFonts w:ascii="Calibri" w:hAnsi="Calibri" w:eastAsia="Hiragino Sans GB"/>
+                <w:b w:val="0"/>
+                <w:color w:val="111827"/>
+                <w:sz w:val="16"/>
+              </w:rPr>
+              <w:t>未识别</w:t>
+            </w:r>
+          </w:p>
+        </w:tc>
+        <w:tc>
+          <w:tcPr>
+            <w:tcW w:type="dxa" w:w="1680"/>
+            <w:vAlign w:val="center"/>
+          </w:tcPr>
+          <w:p>
+            <w:pPr>
+              <w:spacing w:before="0" w:after="0"/>
+            </w:pPr>
+            <w:r/>
+            <w:r>
+              <w:rPr>
+                <w:rFonts w:ascii="Calibri" w:hAnsi="Calibri" w:eastAsia="Hiragino Sans GB"/>
+                <w:b w:val="0"/>
+                <w:color w:val="111827"/>
+                <w:sz w:val="16"/>
+              </w:rPr>
+              <w:t>宏观通胀传导</w:t>
+            </w:r>
+          </w:p>
+        </w:tc>
+        <w:tc>
+          <w:tcPr>
+            <w:tcW w:type="dxa" w:w="900"/>
+            <w:vAlign w:val="center"/>
+          </w:tcPr>
+          <w:p>
+            <w:pPr>
+              <w:spacing w:before="0" w:after="0"/>
+              <w:jc w:val="center"/>
+            </w:pPr>
+            <w:r/>
+            <w:r>
+              <w:rPr>
+                <w:rFonts w:ascii="Calibri" w:hAnsi="Calibri" w:eastAsia="Hiragino Sans GB"/>
+                <w:b/>
+                <w:color w:val="111827"/>
+                <w:sz w:val="17"/>
+              </w:rPr>
+              <w:t>42.7</w:t>
+            </w:r>
+          </w:p>
+        </w:tc>
+        <w:tc>
+          <w:tcPr>
+            <w:tcW w:type="dxa" w:w="1500"/>
+            <w:vAlign w:val="center"/>
+          </w:tcPr>
+          <w:p>
+            <w:pPr>
+              <w:spacing w:before="0" w:after="0"/>
+              <w:jc w:val="center"/>
+            </w:pPr>
+            <w:r/>
+            <w:r>
+              <w:rPr>
+                <w:rFonts w:ascii="Calibri" w:hAnsi="Calibri" w:eastAsia="Hiragino Sans GB"/>
+                <w:b w:val="0"/>
+                <w:color w:val="111827"/>
+                <w:sz w:val="16"/>
+              </w:rPr>
+              <w:t>风险 1</w:t>
+            </w:r>
+          </w:p>
+        </w:tc>
+      </w:tr>
+      <w:tr>
+        <w:tc>
+          <w:tcPr>
+            <w:tcW w:type="dxa" w:w="3720"/>
+            <w:vAlign w:val="center"/>
+          </w:tcPr>
+          <w:p>
+            <w:pPr>
+              <w:spacing w:before="0" w:after="0"/>
+            </w:pPr>
+            <w:r/>
+            <w:r>
+              <w:rPr>
+                <w:rFonts w:ascii="Calibri" w:hAnsi="Calibri" w:eastAsia="Hiragino Sans GB"/>
+                <w:b w:val="0"/>
+                <w:color w:val="111827"/>
+                <w:sz w:val="17"/>
+              </w:rPr>
+              <w:t>2026-08-09 美联储9月维持利率但保留鹰派指引下的跨资产配置</w:t>
+            </w:r>
+          </w:p>
+        </w:tc>
+        <w:tc>
+          <w:tcPr>
+            <w:tcW w:type="dxa" w:w="1560"/>
+            <w:vAlign w:val="center"/>
+          </w:tcPr>
+          <w:p>
+            <w:pPr>
+              <w:spacing w:before="0" w:after="0"/>
+            </w:pPr>
+            <w:r/>
+            <w:r>
+              <w:rPr>
+                <w:rFonts w:ascii="Calibri" w:hAnsi="Calibri" w:eastAsia="Hiragino Sans GB"/>
+                <w:b w:val="0"/>
+                <w:color w:val="111827"/>
+                <w:sz w:val="16"/>
+              </w:rPr>
+              <w:t>未识别</w:t>
+            </w:r>
+          </w:p>
+        </w:tc>
+        <w:tc>
+          <w:tcPr>
+            <w:tcW w:type="dxa" w:w="1680"/>
+            <w:vAlign w:val="center"/>
+          </w:tcPr>
+          <w:p>
+            <w:pPr>
+              <w:spacing w:before="0" w:after="0"/>
+            </w:pPr>
+            <w:r/>
+            <w:r>
+              <w:rPr>
+                <w:rFonts w:ascii="Calibri" w:hAnsi="Calibri" w:eastAsia="Hiragino Sans GB"/>
+                <w:b w:val="0"/>
+                <w:color w:val="111827"/>
+                <w:sz w:val="16"/>
+              </w:rPr>
+              <w:t>宏观通胀传导</w:t>
+            </w:r>
+          </w:p>
+        </w:tc>
+        <w:tc>
+          <w:tcPr>
+            <w:tcW w:type="dxa" w:w="900"/>
+            <w:vAlign w:val="center"/>
+          </w:tcPr>
+          <w:p>
+            <w:pPr>
+              <w:spacing w:before="0" w:after="0"/>
+              <w:jc w:val="center"/>
+            </w:pPr>
+            <w:r/>
+            <w:r>
+              <w:rPr>
+                <w:rFonts w:ascii="Calibri" w:hAnsi="Calibri" w:eastAsia="Hiragino Sans GB"/>
+                <w:b/>
+                <w:color w:val="111827"/>
+                <w:sz w:val="17"/>
+              </w:rPr>
+              <w:t>42.7</w:t>
+            </w:r>
+          </w:p>
+        </w:tc>
+        <w:tc>
+          <w:tcPr>
+            <w:tcW w:type="dxa" w:w="1500"/>
+            <w:vAlign w:val="center"/>
+          </w:tcPr>
+          <w:p>
+            <w:pPr>
+              <w:spacing w:before="0" w:after="0"/>
+              <w:jc w:val="center"/>
+            </w:pPr>
+            <w:r/>
+            <w:r>
+              <w:rPr>
+                <w:rFonts w:ascii="Calibri" w:hAnsi="Calibri" w:eastAsia="Hiragino Sans GB"/>
+                <w:b w:val="0"/>
+                <w:color w:val="111827"/>
+                <w:sz w:val="16"/>
+              </w:rPr>
+              <w:t>风险 1</w:t>
+            </w:r>
+          </w:p>
+        </w:tc>
+      </w:tr>
+      <w:tr>
+        <w:tc>
+          <w:tcPr>
+            <w:tcW w:type="dxa" w:w="3720"/>
+            <w:vAlign w:val="center"/>
+          </w:tcPr>
+          <w:p>
+            <w:pPr>
+              <w:spacing w:before="0" w:after="0"/>
+            </w:pPr>
+            <w:r/>
+            <w:r>
+              <w:rPr>
+                <w:rFonts w:ascii="Calibri" w:hAnsi="Calibri" w:eastAsia="Hiragino Sans GB"/>
+                <w:b w:val="0"/>
+                <w:color w:val="111827"/>
+                <w:sz w:val="17"/>
+              </w:rPr>
+              <w:t>前序研究片 — 9月美联储加息压力测试下的人民币与央行政策空间</w:t>
+            </w:r>
+          </w:p>
+        </w:tc>
+        <w:tc>
+          <w:tcPr>
+            <w:tcW w:type="dxa" w:w="1560"/>
+            <w:vAlign w:val="center"/>
+          </w:tcPr>
+          <w:p>
+            <w:pPr>
+              <w:spacing w:before="0" w:after="0"/>
+            </w:pPr>
+            <w:r/>
+            <w:r>
+              <w:rPr>
+                <w:rFonts w:ascii="Calibri" w:hAnsi="Calibri" w:eastAsia="Hiragino Sans GB"/>
+                <w:b w:val="0"/>
+                <w:color w:val="111827"/>
+                <w:sz w:val="16"/>
+              </w:rPr>
+              <w:t>未识别</w:t>
+            </w:r>
+          </w:p>
+        </w:tc>
+        <w:tc>
+          <w:tcPr>
+            <w:tcW w:type="dxa" w:w="1680"/>
+            <w:vAlign w:val="center"/>
+          </w:tcPr>
+          <w:p>
+            <w:pPr>
+              <w:spacing w:before="0" w:after="0"/>
+            </w:pPr>
+            <w:r/>
+            <w:r>
+              <w:rPr>
+                <w:rFonts w:ascii="Calibri" w:hAnsi="Calibri" w:eastAsia="Hiragino Sans GB"/>
+                <w:b w:val="0"/>
+                <w:color w:val="111827"/>
+                <w:sz w:val="16"/>
+              </w:rPr>
+              <w:t>宏观通胀传导</w:t>
+            </w:r>
+          </w:p>
+        </w:tc>
+        <w:tc>
+          <w:tcPr>
+            <w:tcW w:type="dxa" w:w="900"/>
+            <w:vAlign w:val="center"/>
+          </w:tcPr>
+          <w:p>
+            <w:pPr>
+              <w:spacing w:before="0" w:after="0"/>
+              <w:jc w:val="center"/>
+            </w:pPr>
+            <w:r/>
+            <w:r>
+              <w:rPr>
+                <w:rFonts w:ascii="Calibri" w:hAnsi="Calibri" w:eastAsia="Hiragino Sans GB"/>
                 <w:b/>
                 <w:color w:val="111827"/>
                 <w:sz w:val="17"/>
@@ -1839,7 +2929,7 @@
             <w:r/>
             <w:r>
               <w:rPr>
-                <w:rFonts w:ascii="Calibri" w:hAnsi="Calibri" w:eastAsia="Heiti TC"/>
+                <w:rFonts w:ascii="Calibri" w:hAnsi="Calibri" w:eastAsia="Hiragino Sans GB"/>
                 <w:b w:val="0"/>
                 <w:color w:val="111827"/>
                 <w:sz w:val="16"/>
@@ -1862,12 +2952,12 @@
             <w:r/>
             <w:r>
               <w:rPr>
-                <w:rFonts w:ascii="Calibri" w:hAnsi="Calibri" w:eastAsia="Heiti TC"/>
+                <w:rFonts w:ascii="Calibri" w:hAnsi="Calibri" w:eastAsia="Hiragino Sans GB"/>
                 <w:b w:val="0"/>
                 <w:color w:val="111827"/>
                 <w:sz w:val="17"/>
               </w:rPr>
-              <w:t>研究记录 — 汇率防御升级对在岸利率的被动收紧约束</w:t>
+              <w:t>research discussion Session Brief</w:t>
             </w:r>
           </w:p>
         </w:tc>
@@ -1883,7 +2973,7 @@
             <w:r/>
             <w:r>
               <w:rPr>
-                <w:rFonts w:ascii="Calibri" w:hAnsi="Calibri" w:eastAsia="Heiti TC"/>
+                <w:rFonts w:ascii="Calibri" w:hAnsi="Calibri" w:eastAsia="Hiragino Sans GB"/>
                 <w:b w:val="0"/>
                 <w:color w:val="111827"/>
                 <w:sz w:val="16"/>
@@ -1904,7 +2994,7 @@
             <w:r/>
             <w:r>
               <w:rPr>
-                <w:rFonts w:ascii="Calibri" w:hAnsi="Calibri" w:eastAsia="Heiti TC"/>
+                <w:rFonts w:ascii="Calibri" w:hAnsi="Calibri" w:eastAsia="Hiragino Sans GB"/>
                 <w:b w:val="0"/>
                 <w:color w:val="111827"/>
                 <w:sz w:val="16"/>
@@ -1926,12 +3016,12 @@
             <w:r/>
             <w:r>
               <w:rPr>
-                <w:rFonts w:ascii="Calibri" w:hAnsi="Calibri" w:eastAsia="Heiti TC"/>
+                <w:rFonts w:ascii="Calibri" w:hAnsi="Calibri" w:eastAsia="Hiragino Sans GB"/>
                 <w:b/>
                 <w:color w:val="111827"/>
                 <w:sz w:val="17"/>
               </w:rPr>
-              <w:t>42.1</w:t>
+              <w:t>42.4</w:t>
             </w:r>
           </w:p>
         </w:tc>
@@ -1948,12 +3038,12 @@
             <w:r/>
             <w:r>
               <w:rPr>
-                <w:rFonts w:ascii="Calibri" w:hAnsi="Calibri" w:eastAsia="Heiti TC"/>
+                <w:rFonts w:ascii="Calibri" w:hAnsi="Calibri" w:eastAsia="Hiragino Sans GB"/>
                 <w:b w:val="0"/>
                 <w:color w:val="111827"/>
                 <w:sz w:val="16"/>
               </w:rPr>
-              <w:t>风险 3</w:t>
+              <w:t>常规</w:t>
             </w:r>
           </w:p>
         </w:tc>
@@ -1971,12 +3061,12 @@
             <w:r/>
             <w:r>
               <w:rPr>
-                <w:rFonts w:ascii="Calibri" w:hAnsi="Calibri" w:eastAsia="Heiti TC"/>
+                <w:rFonts w:ascii="Calibri" w:hAnsi="Calibri" w:eastAsia="Hiragino Sans GB"/>
                 <w:b w:val="0"/>
                 <w:color w:val="111827"/>
                 <w:sz w:val="17"/>
               </w:rPr>
-              <w:t>2026-08-09 压力测试：若9月16日美联储加息，中国央行政策空间与人民币应对</w:t>
+              <w:t>将西部枢纽电力成本转化为100MW承销模型（工作日期2026-08-09）</w:t>
             </w:r>
           </w:p>
         </w:tc>
@@ -1992,7 +3082,7 @@
             <w:r/>
             <w:r>
               <w:rPr>
-                <w:rFonts w:ascii="Calibri" w:hAnsi="Calibri" w:eastAsia="Heiti TC"/>
+                <w:rFonts w:ascii="Calibri" w:hAnsi="Calibri" w:eastAsia="Hiragino Sans GB"/>
                 <w:b w:val="0"/>
                 <w:color w:val="111827"/>
                 <w:sz w:val="16"/>
@@ -2013,7 +3103,116 @@
             <w:r/>
             <w:r>
               <w:rPr>
-                <w:rFonts w:ascii="Calibri" w:hAnsi="Calibri" w:eastAsia="Heiti TC"/>
+                <w:rFonts w:ascii="Calibri" w:hAnsi="Calibri" w:eastAsia="Hiragino Sans GB"/>
+                <w:b w:val="0"/>
+                <w:color w:val="111827"/>
+                <w:sz w:val="16"/>
+              </w:rPr>
+              <w:t>AI 基础设施</w:t>
+            </w:r>
+          </w:p>
+        </w:tc>
+        <w:tc>
+          <w:tcPr>
+            <w:tcW w:type="dxa" w:w="900"/>
+            <w:vAlign w:val="center"/>
+          </w:tcPr>
+          <w:p>
+            <w:pPr>
+              <w:spacing w:before="0" w:after="0"/>
+              <w:jc w:val="center"/>
+            </w:pPr>
+            <w:r/>
+            <w:r>
+              <w:rPr>
+                <w:rFonts w:ascii="Calibri" w:hAnsi="Calibri" w:eastAsia="Hiragino Sans GB"/>
+                <w:b/>
+                <w:color w:val="111827"/>
+                <w:sz w:val="17"/>
+              </w:rPr>
+              <w:t>42.3</w:t>
+            </w:r>
+          </w:p>
+        </w:tc>
+        <w:tc>
+          <w:tcPr>
+            <w:tcW w:type="dxa" w:w="1500"/>
+            <w:vAlign w:val="center"/>
+          </w:tcPr>
+          <w:p>
+            <w:pPr>
+              <w:spacing w:before="0" w:after="0"/>
+              <w:jc w:val="center"/>
+            </w:pPr>
+            <w:r/>
+            <w:r>
+              <w:rPr>
+                <w:rFonts w:ascii="Calibri" w:hAnsi="Calibri" w:eastAsia="Hiragino Sans GB"/>
+                <w:b w:val="0"/>
+                <w:color w:val="111827"/>
+                <w:sz w:val="16"/>
+              </w:rPr>
+              <w:t>风险 1</w:t>
+            </w:r>
+          </w:p>
+        </w:tc>
+      </w:tr>
+      <w:tr>
+        <w:tc>
+          <w:tcPr>
+            <w:tcW w:type="dxa" w:w="3720"/>
+            <w:vAlign w:val="center"/>
+          </w:tcPr>
+          <w:p>
+            <w:pPr>
+              <w:spacing w:before="0" w:after="0"/>
+            </w:pPr>
+            <w:r/>
+            <w:r>
+              <w:rPr>
+                <w:rFonts w:ascii="Calibri" w:hAnsi="Calibri" w:eastAsia="Hiragino Sans GB"/>
+                <w:b w:val="0"/>
+                <w:color w:val="111827"/>
+                <w:sz w:val="17"/>
+              </w:rPr>
+              <w:t>AI物理瓶颈篮子的因子暴露与拥挤度阈值回测</w:t>
+            </w:r>
+          </w:p>
+        </w:tc>
+        <w:tc>
+          <w:tcPr>
+            <w:tcW w:type="dxa" w:w="1560"/>
+            <w:vAlign w:val="center"/>
+          </w:tcPr>
+          <w:p>
+            <w:pPr>
+              <w:spacing w:before="0" w:after="0"/>
+            </w:pPr>
+            <w:r/>
+            <w:r>
+              <w:rPr>
+                <w:rFonts w:ascii="Calibri" w:hAnsi="Calibri" w:eastAsia="Hiragino Sans GB"/>
+                <w:b w:val="0"/>
+                <w:color w:val="111827"/>
+                <w:sz w:val="16"/>
+              </w:rPr>
+              <w:t>未识别</w:t>
+            </w:r>
+          </w:p>
+        </w:tc>
+        <w:tc>
+          <w:tcPr>
+            <w:tcW w:type="dxa" w:w="1680"/>
+            <w:vAlign w:val="center"/>
+          </w:tcPr>
+          <w:p>
+            <w:pPr>
+              <w:spacing w:before="0" w:after="0"/>
+            </w:pPr>
+            <w:r/>
+            <w:r>
+              <w:rPr>
+                <w:rFonts w:ascii="Calibri" w:hAnsi="Calibri" w:eastAsia="Hiragino Sans GB"/>
                 <w:b w:val="0"/>
                 <w:color w:val="111827"/>
                 <w:sz w:val="16"/>
@@ -2035,12 +3234,12 @@
             <w:r/>
             <w:r>
               <w:rPr>
-                <w:rFonts w:ascii="Calibri" w:hAnsi="Calibri" w:eastAsia="Heiti TC"/>
+                <w:rFonts w:ascii="Calibri" w:hAnsi="Calibri" w:eastAsia="Hiragino Sans GB"/>
                 <w:b/>
                 <w:color w:val="111827"/>
                 <w:sz w:val="17"/>
               </w:rPr>
-              <w:t>42.1</w:t>
+              <w:t>42.2</w:t>
             </w:r>
           </w:p>
         </w:tc>
@@ -2057,7 +3256,7 @@
             <w:r/>
             <w:r>
               <w:rPr>
-                <w:rFonts w:ascii="Calibri" w:hAnsi="Calibri" w:eastAsia="Heiti TC"/>
+                <w:rFonts w:ascii="Calibri" w:hAnsi="Calibri" w:eastAsia="Hiragino Sans GB"/>
                 <w:b w:val="0"/>
                 <w:color w:val="111827"/>
                 <w:sz w:val="16"/>
@@ -2080,12 +3279,12 @@
             <w:r/>
             <w:r>
               <w:rPr>
-                <w:rFonts w:ascii="Calibri" w:hAnsi="Calibri" w:eastAsia="Heiti TC"/>
+                <w:rFonts w:ascii="Calibri" w:hAnsi="Calibri" w:eastAsia="Hiragino Sans GB"/>
                 <w:b w:val="0"/>
                 <w:color w:val="111827"/>
                 <w:sz w:val="17"/>
               </w:rPr>
-              <w:t>2026-08-09 鹰派美联储维持利率后的中国政策对冲路径</w:t>
+              <w:t>研究记录 — 汇率防御升级对在岸利率的被动收紧约束</w:t>
             </w:r>
           </w:p>
         </w:tc>
@@ -2101,7 +3300,7 @@
             <w:r/>
             <w:r>
               <w:rPr>
-                <w:rFonts w:ascii="Calibri" w:hAnsi="Calibri" w:eastAsia="Heiti TC"/>
+                <w:rFonts w:ascii="Calibri" w:hAnsi="Calibri" w:eastAsia="Hiragino Sans GB"/>
                 <w:b w:val="0"/>
                 <w:color w:val="111827"/>
                 <w:sz w:val="16"/>
@@ -2122,7 +3321,7 @@
             <w:r/>
             <w:r>
               <w:rPr>
-                <w:rFonts w:ascii="Calibri" w:hAnsi="Calibri" w:eastAsia="Heiti TC"/>
+                <w:rFonts w:ascii="Calibri" w:hAnsi="Calibri" w:eastAsia="Hiragino Sans GB"/>
                 <w:b w:val="0"/>
                 <w:color w:val="111827"/>
                 <w:sz w:val="16"/>
@@ -2144,12 +3343,12 @@
             <w:r/>
             <w:r>
               <w:rPr>
-                <w:rFonts w:ascii="Calibri" w:hAnsi="Calibri" w:eastAsia="Heiti TC"/>
+                <w:rFonts w:ascii="Calibri" w:hAnsi="Calibri" w:eastAsia="Hiragino Sans GB"/>
                 <w:b/>
                 <w:color w:val="111827"/>
                 <w:sz w:val="17"/>
               </w:rPr>
-              <w:t>40.9</w:t>
+              <w:t>42.1</w:t>
             </w:r>
           </w:p>
         </w:tc>
@@ -2166,1211 +3365,12 @@
             <w:r/>
             <w:r>
               <w:rPr>
-                <w:rFonts w:ascii="Calibri" w:hAnsi="Calibri" w:eastAsia="Heiti TC"/>
+                <w:rFonts w:ascii="Calibri" w:hAnsi="Calibri" w:eastAsia="Hiragino Sans GB"/>
                 <w:b w:val="0"/>
                 <w:color w:val="111827"/>
                 <w:sz w:val="16"/>
               </w:rPr>
-              <w:t>风险 1</w:t>
-            </w:r>
-          </w:p>
-        </w:tc>
-      </w:tr>
-      <w:tr>
-        <w:tc>
-          <w:tcPr>
-            <w:tcW w:type="dxa" w:w="3720"/>
-            <w:vAlign w:val="center"/>
-          </w:tcPr>
-          <w:p>
-            <w:pPr>
-              <w:spacing w:before="0" w:after="0"/>
-            </w:pPr>
-            <w:r/>
-            <w:r>
-              <w:rPr>
-                <w:rFonts w:ascii="Calibri" w:hAnsi="Calibri" w:eastAsia="Heiti TC"/>
-                <w:b w:val="0"/>
-                <w:color w:val="111827"/>
-                <w:sz w:val="17"/>
-              </w:rPr>
-              <w:t>美股、利率、美元与主要商品周度研究报告(2026-08-03 ~ 2026-08-07)</w:t>
-            </w:r>
-          </w:p>
-        </w:tc>
-        <w:tc>
-          <w:tcPr>
-            <w:tcW w:type="dxa" w:w="1560"/>
-            <w:vAlign w:val="center"/>
-          </w:tcPr>
-          <w:p>
-            <w:pPr>
-              <w:spacing w:before="0" w:after="0"/>
-            </w:pPr>
-            <w:r/>
-            <w:r>
-              <w:rPr>
-                <w:rFonts w:ascii="Calibri" w:hAnsi="Calibri" w:eastAsia="Heiti TC"/>
-                <w:b w:val="0"/>
-                <w:color w:val="111827"/>
-                <w:sz w:val="16"/>
-              </w:rPr>
-              <w:t>未识别</w:t>
-            </w:r>
-          </w:p>
-        </w:tc>
-        <w:tc>
-          <w:tcPr>
-            <w:tcW w:type="dxa" w:w="1680"/>
-            <w:vAlign w:val="center"/>
-          </w:tcPr>
-          <w:p>
-            <w:pPr>
-              <w:spacing w:before="0" w:after="0"/>
-            </w:pPr>
-            <w:r/>
-            <w:r>
-              <w:rPr>
-                <w:rFonts w:ascii="Calibri" w:hAnsi="Calibri" w:eastAsia="Heiti TC"/>
-                <w:b w:val="0"/>
-                <w:color w:val="111827"/>
-                <w:sz w:val="16"/>
-              </w:rPr>
-              <w:t>宏观通胀传导</w:t>
-            </w:r>
-          </w:p>
-        </w:tc>
-        <w:tc>
-          <w:tcPr>
-            <w:tcW w:type="dxa" w:w="900"/>
-            <w:vAlign w:val="center"/>
-          </w:tcPr>
-          <w:p>
-            <w:pPr>
-              <w:spacing w:before="0" w:after="0"/>
-              <w:jc w:val="center"/>
-            </w:pPr>
-            <w:r/>
-            <w:r>
-              <w:rPr>
-                <w:rFonts w:ascii="Calibri" w:hAnsi="Calibri" w:eastAsia="Heiti TC"/>
-                <w:b/>
-                <w:color w:val="111827"/>
-                <w:sz w:val="17"/>
-              </w:rPr>
-              <w:t>40.6</w:t>
-            </w:r>
-          </w:p>
-        </w:tc>
-        <w:tc>
-          <w:tcPr>
-            <w:tcW w:type="dxa" w:w="1500"/>
-            <w:vAlign w:val="center"/>
-          </w:tcPr>
-          <w:p>
-            <w:pPr>
-              <w:spacing w:before="0" w:after="0"/>
-              <w:jc w:val="center"/>
-            </w:pPr>
-            <w:r/>
-            <w:r>
-              <w:rPr>
-                <w:rFonts w:ascii="Calibri" w:hAnsi="Calibri" w:eastAsia="Heiti TC"/>
-                <w:b w:val="0"/>
-                <w:color w:val="111827"/>
-                <w:sz w:val="16"/>
-              </w:rPr>
-              <w:t>常规</w:t>
-            </w:r>
-          </w:p>
-        </w:tc>
-      </w:tr>
-      <w:tr>
-        <w:tc>
-          <w:tcPr>
-            <w:tcW w:type="dxa" w:w="3720"/>
-            <w:vAlign w:val="center"/>
-          </w:tcPr>
-          <w:p>
-            <w:pPr>
-              <w:spacing w:before="0" w:after="0"/>
-            </w:pPr>
-            <w:r/>
-            <w:r>
-              <w:rPr>
-                <w:rFonts w:ascii="Calibri" w:hAnsi="Calibri" w:eastAsia="Heiti TC"/>
-                <w:b w:val="0"/>
-                <w:color w:val="111827"/>
-                <w:sz w:val="17"/>
-              </w:rPr>
-              <w:t>§0 YAML HEADER</w:t>
-            </w:r>
-          </w:p>
-        </w:tc>
-        <w:tc>
-          <w:tcPr>
-            <w:tcW w:type="dxa" w:w="1560"/>
-            <w:vAlign w:val="center"/>
-          </w:tcPr>
-          <w:p>
-            <w:pPr>
-              <w:spacing w:before="0" w:after="0"/>
-            </w:pPr>
-            <w:r/>
-            <w:r>
-              <w:rPr>
-                <w:rFonts w:ascii="Calibri" w:hAnsi="Calibri" w:eastAsia="Heiti TC"/>
-                <w:b w:val="0"/>
-                <w:color w:val="111827"/>
-                <w:sz w:val="16"/>
-              </w:rPr>
-              <w:t>未识别</w:t>
-            </w:r>
-          </w:p>
-        </w:tc>
-        <w:tc>
-          <w:tcPr>
-            <w:tcW w:type="dxa" w:w="1680"/>
-            <w:vAlign w:val="center"/>
-          </w:tcPr>
-          <w:p>
-            <w:pPr>
-              <w:spacing w:before="0" w:after="0"/>
-            </w:pPr>
-            <w:r/>
-            <w:r>
-              <w:rPr>
-                <w:rFonts w:ascii="Calibri" w:hAnsi="Calibri" w:eastAsia="Heiti TC"/>
-                <w:b w:val="0"/>
-                <w:color w:val="111827"/>
-                <w:sz w:val="16"/>
-              </w:rPr>
-              <w:t>宏观通胀传导</w:t>
-            </w:r>
-          </w:p>
-        </w:tc>
-        <w:tc>
-          <w:tcPr>
-            <w:tcW w:type="dxa" w:w="900"/>
-            <w:vAlign w:val="center"/>
-          </w:tcPr>
-          <w:p>
-            <w:pPr>
-              <w:spacing w:before="0" w:after="0"/>
-              <w:jc w:val="center"/>
-            </w:pPr>
-            <w:r/>
-            <w:r>
-              <w:rPr>
-                <w:rFonts w:ascii="Calibri" w:hAnsi="Calibri" w:eastAsia="Heiti TC"/>
-                <w:b/>
-                <w:color w:val="111827"/>
-                <w:sz w:val="17"/>
-              </w:rPr>
-              <w:t>40.6</w:t>
-            </w:r>
-          </w:p>
-        </w:tc>
-        <w:tc>
-          <w:tcPr>
-            <w:tcW w:type="dxa" w:w="1500"/>
-            <w:vAlign w:val="center"/>
-          </w:tcPr>
-          <w:p>
-            <w:pPr>
-              <w:spacing w:before="0" w:after="0"/>
-              <w:jc w:val="center"/>
-            </w:pPr>
-            <w:r/>
-            <w:r>
-              <w:rPr>
-                <w:rFonts w:ascii="Calibri" w:hAnsi="Calibri" w:eastAsia="Heiti TC"/>
-                <w:b w:val="0"/>
-                <w:color w:val="111827"/>
-                <w:sz w:val="16"/>
-              </w:rPr>
-              <w:t>风险 1</w:t>
-            </w:r>
-          </w:p>
-        </w:tc>
-      </w:tr>
-      <w:tr>
-        <w:tc>
-          <w:tcPr>
-            <w:tcW w:type="dxa" w:w="3720"/>
-            <w:vAlign w:val="center"/>
-          </w:tcPr>
-          <w:p>
-            <w:pPr>
-              <w:spacing w:before="0" w:after="0"/>
-            </w:pPr>
-            <w:r/>
-            <w:r>
-              <w:rPr>
-                <w:rFonts w:ascii="Calibri" w:hAnsi="Calibri" w:eastAsia="Heiti TC"/>
-                <w:b w:val="0"/>
-                <w:color w:val="111827"/>
-                <w:sz w:val="17"/>
-              </w:rPr>
-              <w:t>research discussion Session Brief</w:t>
-            </w:r>
-          </w:p>
-        </w:tc>
-        <w:tc>
-          <w:tcPr>
-            <w:tcW w:type="dxa" w:w="1560"/>
-            <w:vAlign w:val="center"/>
-          </w:tcPr>
-          <w:p>
-            <w:pPr>
-              <w:spacing w:before="0" w:after="0"/>
-            </w:pPr>
-            <w:r/>
-            <w:r>
-              <w:rPr>
-                <w:rFonts w:ascii="Calibri" w:hAnsi="Calibri" w:eastAsia="Heiti TC"/>
-                <w:b w:val="0"/>
-                <w:color w:val="111827"/>
-                <w:sz w:val="16"/>
-              </w:rPr>
-              <w:t>未识别</w:t>
-            </w:r>
-          </w:p>
-        </w:tc>
-        <w:tc>
-          <w:tcPr>
-            <w:tcW w:type="dxa" w:w="1680"/>
-            <w:vAlign w:val="center"/>
-          </w:tcPr>
-          <w:p>
-            <w:pPr>
-              <w:spacing w:before="0" w:after="0"/>
-            </w:pPr>
-            <w:r/>
-            <w:r>
-              <w:rPr>
-                <w:rFonts w:ascii="Calibri" w:hAnsi="Calibri" w:eastAsia="Heiti TC"/>
-                <w:b w:val="0"/>
-                <w:color w:val="111827"/>
-                <w:sz w:val="16"/>
-              </w:rPr>
-              <w:t>AI 基础设施</w:t>
-            </w:r>
-          </w:p>
-        </w:tc>
-        <w:tc>
-          <w:tcPr>
-            <w:tcW w:type="dxa" w:w="900"/>
-            <w:vAlign w:val="center"/>
-          </w:tcPr>
-          <w:p>
-            <w:pPr>
-              <w:spacing w:before="0" w:after="0"/>
-              <w:jc w:val="center"/>
-            </w:pPr>
-            <w:r/>
-            <w:r>
-              <w:rPr>
-                <w:rFonts w:ascii="Calibri" w:hAnsi="Calibri" w:eastAsia="Heiti TC"/>
-                <w:b/>
-                <w:color w:val="111827"/>
-                <w:sz w:val="17"/>
-              </w:rPr>
-              <w:t>39.8</w:t>
-            </w:r>
-          </w:p>
-        </w:tc>
-        <w:tc>
-          <w:tcPr>
-            <w:tcW w:type="dxa" w:w="1500"/>
-            <w:vAlign w:val="center"/>
-          </w:tcPr>
-          <w:p>
-            <w:pPr>
-              <w:spacing w:before="0" w:after="0"/>
-              <w:jc w:val="center"/>
-            </w:pPr>
-            <w:r/>
-            <w:r>
-              <w:rPr>
-                <w:rFonts w:ascii="Calibri" w:hAnsi="Calibri" w:eastAsia="Heiti TC"/>
-                <w:b w:val="0"/>
-                <w:color w:val="111827"/>
-                <w:sz w:val="16"/>
-              </w:rPr>
-              <w:t>风险 1</w:t>
-            </w:r>
-          </w:p>
-        </w:tc>
-      </w:tr>
-      <w:tr>
-        <w:tc>
-          <w:tcPr>
-            <w:tcW w:type="dxa" w:w="3720"/>
-            <w:vAlign w:val="center"/>
-          </w:tcPr>
-          <w:p>
-            <w:pPr>
-              <w:spacing w:before="0" w:after="0"/>
-            </w:pPr>
-            <w:r/>
-            <w:r>
-              <w:rPr>
-                <w:rFonts w:ascii="Calibri" w:hAnsi="Calibri" w:eastAsia="Heiti TC"/>
-                <w:b w:val="0"/>
-                <w:color w:val="111827"/>
-                <w:sz w:val="17"/>
-              </w:rPr>
-              <w:t>研究记录02 多资产配置压力测试 - 2026-08-09</w:t>
-            </w:r>
-          </w:p>
-        </w:tc>
-        <w:tc>
-          <w:tcPr>
-            <w:tcW w:type="dxa" w:w="1560"/>
-            <w:vAlign w:val="center"/>
-          </w:tcPr>
-          <w:p>
-            <w:pPr>
-              <w:spacing w:before="0" w:after="0"/>
-            </w:pPr>
-            <w:r/>
-            <w:r>
-              <w:rPr>
-                <w:rFonts w:ascii="Calibri" w:hAnsi="Calibri" w:eastAsia="Heiti TC"/>
-                <w:b w:val="0"/>
-                <w:color w:val="111827"/>
-                <w:sz w:val="16"/>
-              </w:rPr>
-              <w:t>未识别</w:t>
-            </w:r>
-          </w:p>
-        </w:tc>
-        <w:tc>
-          <w:tcPr>
-            <w:tcW w:type="dxa" w:w="1680"/>
-            <w:vAlign w:val="center"/>
-          </w:tcPr>
-          <w:p>
-            <w:pPr>
-              <w:spacing w:before="0" w:after="0"/>
-            </w:pPr>
-            <w:r/>
-            <w:r>
-              <w:rPr>
-                <w:rFonts w:ascii="Calibri" w:hAnsi="Calibri" w:eastAsia="Heiti TC"/>
-                <w:b w:val="0"/>
-                <w:color w:val="111827"/>
-                <w:sz w:val="16"/>
-              </w:rPr>
-              <w:t>AI 基础设施</w:t>
-            </w:r>
-          </w:p>
-        </w:tc>
-        <w:tc>
-          <w:tcPr>
-            <w:tcW w:type="dxa" w:w="900"/>
-            <w:vAlign w:val="center"/>
-          </w:tcPr>
-          <w:p>
-            <w:pPr>
-              <w:spacing w:before="0" w:after="0"/>
-              <w:jc w:val="center"/>
-            </w:pPr>
-            <w:r/>
-            <w:r>
-              <w:rPr>
-                <w:rFonts w:ascii="Calibri" w:hAnsi="Calibri" w:eastAsia="Heiti TC"/>
-                <w:b/>
-                <w:color w:val="111827"/>
-                <w:sz w:val="17"/>
-              </w:rPr>
-              <w:t>39.7</w:t>
-            </w:r>
-          </w:p>
-        </w:tc>
-        <w:tc>
-          <w:tcPr>
-            <w:tcW w:type="dxa" w:w="1500"/>
-            <w:vAlign w:val="center"/>
-          </w:tcPr>
-          <w:p>
-            <w:pPr>
-              <w:spacing w:before="0" w:after="0"/>
-              <w:jc w:val="center"/>
-            </w:pPr>
-            <w:r/>
-            <w:r>
-              <w:rPr>
-                <w:rFonts w:ascii="Calibri" w:hAnsi="Calibri" w:eastAsia="Heiti TC"/>
-                <w:b w:val="0"/>
-                <w:color w:val="111827"/>
-                <w:sz w:val="16"/>
-              </w:rPr>
-              <w:t>风险 2</w:t>
-            </w:r>
-          </w:p>
-        </w:tc>
-      </w:tr>
-      <w:tr>
-        <w:tc>
-          <w:tcPr>
-            <w:tcW w:type="dxa" w:w="3720"/>
-            <w:vAlign w:val="center"/>
-          </w:tcPr>
-          <w:p>
-            <w:pPr>
-              <w:spacing w:before="0" w:after="0"/>
-            </w:pPr>
-            <w:r/>
-            <w:r>
-              <w:rPr>
-                <w:rFonts w:ascii="Calibri" w:hAnsi="Calibri" w:eastAsia="Heiti TC"/>
-                <w:b w:val="0"/>
-                <w:color w:val="111827"/>
-                <w:sz w:val="17"/>
-              </w:rPr>
-              <w:t>QA 复核：美国宏观与权益市场周报</w:t>
-            </w:r>
-          </w:p>
-        </w:tc>
-        <w:tc>
-          <w:tcPr>
-            <w:tcW w:type="dxa" w:w="1560"/>
-            <w:vAlign w:val="center"/>
-          </w:tcPr>
-          <w:p>
-            <w:pPr>
-              <w:spacing w:before="0" w:after="0"/>
-            </w:pPr>
-            <w:r/>
-            <w:r>
-              <w:rPr>
-                <w:rFonts w:ascii="Calibri" w:hAnsi="Calibri" w:eastAsia="Heiti TC"/>
-                <w:b w:val="0"/>
-                <w:color w:val="111827"/>
-                <w:sz w:val="16"/>
-              </w:rPr>
-              <w:t>未识别</w:t>
-            </w:r>
-          </w:p>
-        </w:tc>
-        <w:tc>
-          <w:tcPr>
-            <w:tcW w:type="dxa" w:w="1680"/>
-            <w:vAlign w:val="center"/>
-          </w:tcPr>
-          <w:p>
-            <w:pPr>
-              <w:spacing w:before="0" w:after="0"/>
-            </w:pPr>
-            <w:r/>
-            <w:r>
-              <w:rPr>
-                <w:rFonts w:ascii="Calibri" w:hAnsi="Calibri" w:eastAsia="Heiti TC"/>
-                <w:b w:val="0"/>
-                <w:color w:val="111827"/>
-                <w:sz w:val="16"/>
-              </w:rPr>
-              <w:t>宏观通胀传导</w:t>
-            </w:r>
-          </w:p>
-        </w:tc>
-        <w:tc>
-          <w:tcPr>
-            <w:tcW w:type="dxa" w:w="900"/>
-            <w:vAlign w:val="center"/>
-          </w:tcPr>
-          <w:p>
-            <w:pPr>
-              <w:spacing w:before="0" w:after="0"/>
-              <w:jc w:val="center"/>
-            </w:pPr>
-            <w:r/>
-            <w:r>
-              <w:rPr>
-                <w:rFonts w:ascii="Calibri" w:hAnsi="Calibri" w:eastAsia="Heiti TC"/>
-                <w:b/>
-                <w:color w:val="111827"/>
-                <w:sz w:val="17"/>
-              </w:rPr>
-              <w:t>39.6</w:t>
-            </w:r>
-          </w:p>
-        </w:tc>
-        <w:tc>
-          <w:tcPr>
-            <w:tcW w:type="dxa" w:w="1500"/>
-            <w:vAlign w:val="center"/>
-          </w:tcPr>
-          <w:p>
-            <w:pPr>
-              <w:spacing w:before="0" w:after="0"/>
-              <w:jc w:val="center"/>
-            </w:pPr>
-            <w:r/>
-            <w:r>
-              <w:rPr>
-                <w:rFonts w:ascii="Calibri" w:hAnsi="Calibri" w:eastAsia="Heiti TC"/>
-                <w:b w:val="0"/>
-                <w:color w:val="111827"/>
-                <w:sz w:val="16"/>
-              </w:rPr>
-              <w:t>常规</w:t>
-            </w:r>
-          </w:p>
-        </w:tc>
-      </w:tr>
-      <w:tr>
-        <w:tc>
-          <w:tcPr>
-            <w:tcW w:type="dxa" w:w="3720"/>
-            <w:vAlign w:val="center"/>
-          </w:tcPr>
-          <w:p>
-            <w:pPr>
-              <w:spacing w:before="0" w:after="0"/>
-            </w:pPr>
-            <w:r/>
-            <w:r>
-              <w:rPr>
-                <w:rFonts w:ascii="Calibri" w:hAnsi="Calibri" w:eastAsia="Heiti TC"/>
-                <w:b w:val="0"/>
-                <w:color w:val="111827"/>
-                <w:sz w:val="17"/>
-              </w:rPr>
-              <w:t>鹰派美联储维持利率下的银行/保险红利可持续性</w:t>
-            </w:r>
-          </w:p>
-        </w:tc>
-        <w:tc>
-          <w:tcPr>
-            <w:tcW w:type="dxa" w:w="1560"/>
-            <w:vAlign w:val="center"/>
-          </w:tcPr>
-          <w:p>
-            <w:pPr>
-              <w:spacing w:before="0" w:after="0"/>
-            </w:pPr>
-            <w:r/>
-            <w:r>
-              <w:rPr>
-                <w:rFonts w:ascii="Calibri" w:hAnsi="Calibri" w:eastAsia="Heiti TC"/>
-                <w:b w:val="0"/>
-                <w:color w:val="111827"/>
-                <w:sz w:val="16"/>
-              </w:rPr>
-              <w:t>未识别</w:t>
-            </w:r>
-          </w:p>
-        </w:tc>
-        <w:tc>
-          <w:tcPr>
-            <w:tcW w:type="dxa" w:w="1680"/>
-            <w:vAlign w:val="center"/>
-          </w:tcPr>
-          <w:p>
-            <w:pPr>
-              <w:spacing w:before="0" w:after="0"/>
-            </w:pPr>
-            <w:r/>
-            <w:r>
-              <w:rPr>
-                <w:rFonts w:ascii="Calibri" w:hAnsi="Calibri" w:eastAsia="Heiti TC"/>
-                <w:b w:val="0"/>
-                <w:color w:val="111827"/>
-                <w:sz w:val="16"/>
-              </w:rPr>
-              <w:t>宏观通胀传导</w:t>
-            </w:r>
-          </w:p>
-        </w:tc>
-        <w:tc>
-          <w:tcPr>
-            <w:tcW w:type="dxa" w:w="900"/>
-            <w:vAlign w:val="center"/>
-          </w:tcPr>
-          <w:p>
-            <w:pPr>
-              <w:spacing w:before="0" w:after="0"/>
-              <w:jc w:val="center"/>
-            </w:pPr>
-            <w:r/>
-            <w:r>
-              <w:rPr>
-                <w:rFonts w:ascii="Calibri" w:hAnsi="Calibri" w:eastAsia="Heiti TC"/>
-                <w:b/>
-                <w:color w:val="111827"/>
-                <w:sz w:val="17"/>
-              </w:rPr>
-              <w:t>38.8</w:t>
-            </w:r>
-          </w:p>
-        </w:tc>
-        <w:tc>
-          <w:tcPr>
-            <w:tcW w:type="dxa" w:w="1500"/>
-            <w:vAlign w:val="center"/>
-          </w:tcPr>
-          <w:p>
-            <w:pPr>
-              <w:spacing w:before="0" w:after="0"/>
-              <w:jc w:val="center"/>
-            </w:pPr>
-            <w:r/>
-            <w:r>
-              <w:rPr>
-                <w:rFonts w:ascii="Calibri" w:hAnsi="Calibri" w:eastAsia="Heiti TC"/>
-                <w:b w:val="0"/>
-                <w:color w:val="111827"/>
-                <w:sz w:val="16"/>
-              </w:rPr>
-              <w:t>风险 1</w:t>
-            </w:r>
-          </w:p>
-        </w:tc>
-      </w:tr>
-      <w:tr>
-        <w:tc>
-          <w:tcPr>
-            <w:tcW w:type="dxa" w:w="3720"/>
-            <w:vAlign w:val="center"/>
-          </w:tcPr>
-          <w:p>
-            <w:pPr>
-              <w:spacing w:before="0" w:after="0"/>
-            </w:pPr>
-            <w:r/>
-            <w:r>
-              <w:rPr>
-                <w:rFonts w:ascii="Calibri" w:hAnsi="Calibri" w:eastAsia="Heiti TC"/>
-                <w:b w:val="0"/>
-                <w:color w:val="111827"/>
-                <w:sz w:val="17"/>
-              </w:rPr>
-              <w:t>美联储9月维持鹰派指引情形下的A股板块与风格配置</w:t>
-            </w:r>
-          </w:p>
-        </w:tc>
-        <w:tc>
-          <w:tcPr>
-            <w:tcW w:type="dxa" w:w="1560"/>
-            <w:vAlign w:val="center"/>
-          </w:tcPr>
-          <w:p>
-            <w:pPr>
-              <w:spacing w:before="0" w:after="0"/>
-            </w:pPr>
-            <w:r/>
-            <w:r>
-              <w:rPr>
-                <w:rFonts w:ascii="Calibri" w:hAnsi="Calibri" w:eastAsia="Heiti TC"/>
-                <w:b w:val="0"/>
-                <w:color w:val="111827"/>
-                <w:sz w:val="16"/>
-              </w:rPr>
-              <w:t>未识别</w:t>
-            </w:r>
-          </w:p>
-        </w:tc>
-        <w:tc>
-          <w:tcPr>
-            <w:tcW w:type="dxa" w:w="1680"/>
-            <w:vAlign w:val="center"/>
-          </w:tcPr>
-          <w:p>
-            <w:pPr>
-              <w:spacing w:before="0" w:after="0"/>
-            </w:pPr>
-            <w:r/>
-            <w:r>
-              <w:rPr>
-                <w:rFonts w:ascii="Calibri" w:hAnsi="Calibri" w:eastAsia="Heiti TC"/>
-                <w:b w:val="0"/>
-                <w:color w:val="111827"/>
-                <w:sz w:val="16"/>
-              </w:rPr>
-              <w:t>宏观通胀传导</w:t>
-            </w:r>
-          </w:p>
-        </w:tc>
-        <w:tc>
-          <w:tcPr>
-            <w:tcW w:type="dxa" w:w="900"/>
-            <w:vAlign w:val="center"/>
-          </w:tcPr>
-          <w:p>
-            <w:pPr>
-              <w:spacing w:before="0" w:after="0"/>
-              <w:jc w:val="center"/>
-            </w:pPr>
-            <w:r/>
-            <w:r>
-              <w:rPr>
-                <w:rFonts w:ascii="Calibri" w:hAnsi="Calibri" w:eastAsia="Heiti TC"/>
-                <w:b/>
-                <w:color w:val="111827"/>
-                <w:sz w:val="17"/>
-              </w:rPr>
-              <w:t>38.7</w:t>
-            </w:r>
-          </w:p>
-        </w:tc>
-        <w:tc>
-          <w:tcPr>
-            <w:tcW w:type="dxa" w:w="1500"/>
-            <w:vAlign w:val="center"/>
-          </w:tcPr>
-          <w:p>
-            <w:pPr>
-              <w:spacing w:before="0" w:after="0"/>
-              <w:jc w:val="center"/>
-            </w:pPr>
-            <w:r/>
-            <w:r>
-              <w:rPr>
-                <w:rFonts w:ascii="Calibri" w:hAnsi="Calibri" w:eastAsia="Heiti TC"/>
-                <w:b w:val="0"/>
-                <w:color w:val="111827"/>
-                <w:sz w:val="16"/>
-              </w:rPr>
-              <w:t>常规</w:t>
-            </w:r>
-          </w:p>
-        </w:tc>
-      </w:tr>
-      <w:tr>
-        <w:tc>
-          <w:tcPr>
-            <w:tcW w:type="dxa" w:w="3720"/>
-            <w:vAlign w:val="center"/>
-          </w:tcPr>
-          <w:p>
-            <w:pPr>
-              <w:spacing w:before="0" w:after="0"/>
-            </w:pPr>
-            <w:r/>
-            <w:r>
-              <w:rPr>
-                <w:rFonts w:ascii="Calibri" w:hAnsi="Calibri" w:eastAsia="Heiti TC"/>
-                <w:b w:val="0"/>
-                <w:color w:val="111827"/>
-                <w:sz w:val="17"/>
-              </w:rPr>
-              <w:t>研究记录 — PPI转正是否削弱了央行持续定向宽松的论证前提？</w:t>
-            </w:r>
-          </w:p>
-        </w:tc>
-        <w:tc>
-          <w:tcPr>
-            <w:tcW w:type="dxa" w:w="1560"/>
-            <w:vAlign w:val="center"/>
-          </w:tcPr>
-          <w:p>
-            <w:pPr>
-              <w:spacing w:before="0" w:after="0"/>
-            </w:pPr>
-            <w:r/>
-            <w:r>
-              <w:rPr>
-                <w:rFonts w:ascii="Calibri" w:hAnsi="Calibri" w:eastAsia="Heiti TC"/>
-                <w:b w:val="0"/>
-                <w:color w:val="111827"/>
-                <w:sz w:val="16"/>
-              </w:rPr>
-              <w:t>未识别</w:t>
-            </w:r>
-          </w:p>
-        </w:tc>
-        <w:tc>
-          <w:tcPr>
-            <w:tcW w:type="dxa" w:w="1680"/>
-            <w:vAlign w:val="center"/>
-          </w:tcPr>
-          <w:p>
-            <w:pPr>
-              <w:spacing w:before="0" w:after="0"/>
-            </w:pPr>
-            <w:r/>
-            <w:r>
-              <w:rPr>
-                <w:rFonts w:ascii="Calibri" w:hAnsi="Calibri" w:eastAsia="Heiti TC"/>
-                <w:b w:val="0"/>
-                <w:color w:val="111827"/>
-                <w:sz w:val="16"/>
-              </w:rPr>
-              <w:t>宏观通胀传导</w:t>
-            </w:r>
-          </w:p>
-        </w:tc>
-        <w:tc>
-          <w:tcPr>
-            <w:tcW w:type="dxa" w:w="900"/>
-            <w:vAlign w:val="center"/>
-          </w:tcPr>
-          <w:p>
-            <w:pPr>
-              <w:spacing w:before="0" w:after="0"/>
-              <w:jc w:val="center"/>
-            </w:pPr>
-            <w:r/>
-            <w:r>
-              <w:rPr>
-                <w:rFonts w:ascii="Calibri" w:hAnsi="Calibri" w:eastAsia="Heiti TC"/>
-                <w:b/>
-                <w:color w:val="111827"/>
-                <w:sz w:val="17"/>
-              </w:rPr>
-              <w:t>38.4</w:t>
-            </w:r>
-          </w:p>
-        </w:tc>
-        <w:tc>
-          <w:tcPr>
-            <w:tcW w:type="dxa" w:w="1500"/>
-            <w:vAlign w:val="center"/>
-          </w:tcPr>
-          <w:p>
-            <w:pPr>
-              <w:spacing w:before="0" w:after="0"/>
-              <w:jc w:val="center"/>
-            </w:pPr>
-            <w:r/>
-            <w:r>
-              <w:rPr>
-                <w:rFonts w:ascii="Calibri" w:hAnsi="Calibri" w:eastAsia="Heiti TC"/>
-                <w:b w:val="0"/>
-                <w:color w:val="111827"/>
-                <w:sz w:val="16"/>
-              </w:rPr>
-              <w:t>风险 1</w:t>
-            </w:r>
-          </w:p>
-        </w:tc>
-      </w:tr>
-      <w:tr>
-        <w:tc>
-          <w:tcPr>
-            <w:tcW w:type="dxa" w:w="3720"/>
-            <w:vAlign w:val="center"/>
-          </w:tcPr>
-          <w:p>
-            <w:pPr>
-              <w:spacing w:before="0" w:after="0"/>
-            </w:pPr>
-            <w:r/>
-            <w:r>
-              <w:rPr>
-                <w:rFonts w:ascii="Calibri" w:hAnsi="Calibri" w:eastAsia="Heiti TC"/>
-                <w:b w:val="0"/>
-                <w:color w:val="111827"/>
-                <w:sz w:val="17"/>
-              </w:rPr>
-              <w:t>汇率防御与国内流动性投放的政策工具冲突压力测试</w:t>
-            </w:r>
-          </w:p>
-        </w:tc>
-        <w:tc>
-          <w:tcPr>
-            <w:tcW w:type="dxa" w:w="1560"/>
-            <w:vAlign w:val="center"/>
-          </w:tcPr>
-          <w:p>
-            <w:pPr>
-              <w:spacing w:before="0" w:after="0"/>
-            </w:pPr>
-            <w:r/>
-            <w:r>
-              <w:rPr>
-                <w:rFonts w:ascii="Calibri" w:hAnsi="Calibri" w:eastAsia="Heiti TC"/>
-                <w:b w:val="0"/>
-                <w:color w:val="111827"/>
-                <w:sz w:val="16"/>
-              </w:rPr>
-              <w:t>未识别</w:t>
-            </w:r>
-          </w:p>
-        </w:tc>
-        <w:tc>
-          <w:tcPr>
-            <w:tcW w:type="dxa" w:w="1680"/>
-            <w:vAlign w:val="center"/>
-          </w:tcPr>
-          <w:p>
-            <w:pPr>
-              <w:spacing w:before="0" w:after="0"/>
-            </w:pPr>
-            <w:r/>
-            <w:r>
-              <w:rPr>
-                <w:rFonts w:ascii="Calibri" w:hAnsi="Calibri" w:eastAsia="Heiti TC"/>
-                <w:b w:val="0"/>
-                <w:color w:val="111827"/>
-                <w:sz w:val="16"/>
-              </w:rPr>
-              <w:t>AI 基础设施</w:t>
-            </w:r>
-          </w:p>
-        </w:tc>
-        <w:tc>
-          <w:tcPr>
-            <w:tcW w:type="dxa" w:w="900"/>
-            <w:vAlign w:val="center"/>
-          </w:tcPr>
-          <w:p>
-            <w:pPr>
-              <w:spacing w:before="0" w:after="0"/>
-              <w:jc w:val="center"/>
-            </w:pPr>
-            <w:r/>
-            <w:r>
-              <w:rPr>
-                <w:rFonts w:ascii="Calibri" w:hAnsi="Calibri" w:eastAsia="Heiti TC"/>
-                <w:b/>
-                <w:color w:val="111827"/>
-                <w:sz w:val="17"/>
-              </w:rPr>
-              <w:t>38.3</w:t>
-            </w:r>
-          </w:p>
-        </w:tc>
-        <w:tc>
-          <w:tcPr>
-            <w:tcW w:type="dxa" w:w="1500"/>
-            <w:vAlign w:val="center"/>
-          </w:tcPr>
-          <w:p>
-            <w:pPr>
-              <w:spacing w:before="0" w:after="0"/>
-              <w:jc w:val="center"/>
-            </w:pPr>
-            <w:r/>
-            <w:r>
-              <w:rPr>
-                <w:rFonts w:ascii="Calibri" w:hAnsi="Calibri" w:eastAsia="Heiti TC"/>
-                <w:b w:val="0"/>
-                <w:color w:val="111827"/>
-                <w:sz w:val="16"/>
-              </w:rPr>
-              <w:t>风险 2</w:t>
-            </w:r>
-          </w:p>
-        </w:tc>
-      </w:tr>
-      <w:tr>
-        <w:tc>
-          <w:tcPr>
-            <w:tcW w:type="dxa" w:w="3720"/>
-            <w:vAlign w:val="center"/>
-          </w:tcPr>
-          <w:p>
-            <w:pPr>
-              <w:spacing w:before="0" w:after="0"/>
-            </w:pPr>
-            <w:r/>
-            <w:r>
-              <w:rPr>
-                <w:rFonts w:ascii="Calibri" w:hAnsi="Calibri" w:eastAsia="Heiti TC"/>
-                <w:b w:val="0"/>
-                <w:color w:val="111827"/>
-                <w:sz w:val="17"/>
-              </w:rPr>
-              <w:t>prior research notes— A股行业宽度能否支持"外需/先进制造 vs 内需滞后"的杠铃结构？</w:t>
-            </w:r>
-          </w:p>
-        </w:tc>
-        <w:tc>
-          <w:tcPr>
-            <w:tcW w:type="dxa" w:w="1560"/>
-            <w:vAlign w:val="center"/>
-          </w:tcPr>
-          <w:p>
-            <w:pPr>
-              <w:spacing w:before="0" w:after="0"/>
-            </w:pPr>
-            <w:r/>
-            <w:r>
-              <w:rPr>
-                <w:rFonts w:ascii="Calibri" w:hAnsi="Calibri" w:eastAsia="Heiti TC"/>
-                <w:b w:val="0"/>
-                <w:color w:val="111827"/>
-                <w:sz w:val="16"/>
-              </w:rPr>
-              <w:t>未识别</w:t>
-            </w:r>
-          </w:p>
-        </w:tc>
-        <w:tc>
-          <w:tcPr>
-            <w:tcW w:type="dxa" w:w="1680"/>
-            <w:vAlign w:val="center"/>
-          </w:tcPr>
-          <w:p>
-            <w:pPr>
-              <w:spacing w:before="0" w:after="0"/>
-            </w:pPr>
-            <w:r/>
-            <w:r>
-              <w:rPr>
-                <w:rFonts w:ascii="Calibri" w:hAnsi="Calibri" w:eastAsia="Heiti TC"/>
-                <w:b w:val="0"/>
-                <w:color w:val="111827"/>
-                <w:sz w:val="16"/>
-              </w:rPr>
-              <w:t>宏观通胀传导</w:t>
-            </w:r>
-          </w:p>
-        </w:tc>
-        <w:tc>
-          <w:tcPr>
-            <w:tcW w:type="dxa" w:w="900"/>
-            <w:vAlign w:val="center"/>
-          </w:tcPr>
-          <w:p>
-            <w:pPr>
-              <w:spacing w:before="0" w:after="0"/>
-              <w:jc w:val="center"/>
-            </w:pPr>
-            <w:r/>
-            <w:r>
-              <w:rPr>
-                <w:rFonts w:ascii="Calibri" w:hAnsi="Calibri" w:eastAsia="Heiti TC"/>
-                <w:b/>
-                <w:color w:val="111827"/>
-                <w:sz w:val="17"/>
-              </w:rPr>
-              <w:t>38.2</w:t>
-            </w:r>
-          </w:p>
-        </w:tc>
-        <w:tc>
-          <w:tcPr>
-            <w:tcW w:type="dxa" w:w="1500"/>
-            <w:vAlign w:val="center"/>
-          </w:tcPr>
-          <w:p>
-            <w:pPr>
-              <w:spacing w:before="0" w:after="0"/>
-              <w:jc w:val="center"/>
-            </w:pPr>
-            <w:r/>
-            <w:r>
-              <w:rPr>
-                <w:rFonts w:ascii="Calibri" w:hAnsi="Calibri" w:eastAsia="Heiti TC"/>
-                <w:b w:val="0"/>
-                <w:color w:val="111827"/>
-                <w:sz w:val="16"/>
-              </w:rPr>
-              <w:t>风险 1</w:t>
-            </w:r>
-          </w:p>
-        </w:tc>
-      </w:tr>
-      <w:tr>
-        <w:tc>
-          <w:tcPr>
-            <w:tcW w:type="dxa" w:w="3720"/>
-            <w:vAlign w:val="center"/>
-          </w:tcPr>
-          <w:p>
-            <w:pPr>
-              <w:spacing w:before="0" w:after="0"/>
-            </w:pPr>
-            <w:r/>
-            <w:r>
-              <w:rPr>
-                <w:rFonts w:ascii="Calibri" w:hAnsi="Calibri" w:eastAsia="Heiti TC"/>
-                <w:b w:val="0"/>
-                <w:color w:val="111827"/>
-                <w:sz w:val="17"/>
-              </w:rPr>
-              <w:t>前端资金冲击下的同业存单发行与久期配置压力测试</w:t>
-            </w:r>
-          </w:p>
-        </w:tc>
-        <w:tc>
-          <w:tcPr>
-            <w:tcW w:type="dxa" w:w="1560"/>
-            <w:vAlign w:val="center"/>
-          </w:tcPr>
-          <w:p>
-            <w:pPr>
-              <w:spacing w:before="0" w:after="0"/>
-            </w:pPr>
-            <w:r/>
-            <w:r>
-              <w:rPr>
-                <w:rFonts w:ascii="Calibri" w:hAnsi="Calibri" w:eastAsia="Heiti TC"/>
-                <w:b w:val="0"/>
-                <w:color w:val="111827"/>
-                <w:sz w:val="16"/>
-              </w:rPr>
-              <w:t>未识别</w:t>
-            </w:r>
-          </w:p>
-        </w:tc>
-        <w:tc>
-          <w:tcPr>
-            <w:tcW w:type="dxa" w:w="1680"/>
-            <w:vAlign w:val="center"/>
-          </w:tcPr>
-          <w:p>
-            <w:pPr>
-              <w:spacing w:before="0" w:after="0"/>
-            </w:pPr>
-            <w:r/>
-            <w:r>
-              <w:rPr>
-                <w:rFonts w:ascii="Calibri" w:hAnsi="Calibri" w:eastAsia="Heiti TC"/>
-                <w:b w:val="0"/>
-                <w:color w:val="111827"/>
-                <w:sz w:val="16"/>
-              </w:rPr>
-              <w:t>AI 基础设施</w:t>
-            </w:r>
-          </w:p>
-        </w:tc>
-        <w:tc>
-          <w:tcPr>
-            <w:tcW w:type="dxa" w:w="900"/>
-            <w:vAlign w:val="center"/>
-          </w:tcPr>
-          <w:p>
-            <w:pPr>
-              <w:spacing w:before="0" w:after="0"/>
-              <w:jc w:val="center"/>
-            </w:pPr>
-            <w:r/>
-            <w:r>
-              <w:rPr>
-                <w:rFonts w:ascii="Calibri" w:hAnsi="Calibri" w:eastAsia="Heiti TC"/>
-                <w:b/>
-                <w:color w:val="111827"/>
-                <w:sz w:val="17"/>
-              </w:rPr>
-              <w:t>38.1</w:t>
-            </w:r>
-          </w:p>
-        </w:tc>
-        <w:tc>
-          <w:tcPr>
-            <w:tcW w:type="dxa" w:w="1500"/>
-            <w:vAlign w:val="center"/>
-          </w:tcPr>
-          <w:p>
-            <w:pPr>
-              <w:spacing w:before="0" w:after="0"/>
-              <w:jc w:val="center"/>
-            </w:pPr>
-            <w:r/>
-            <w:r>
-              <w:rPr>
-                <w:rFonts w:ascii="Calibri" w:hAnsi="Calibri" w:eastAsia="Heiti TC"/>
-                <w:b w:val="0"/>
-                <w:color w:val="111827"/>
-                <w:sz w:val="16"/>
-              </w:rPr>
-              <w:t>风险 2</w:t>
+              <w:t>风险 3</w:t>
             </w:r>
           </w:p>
         </w:tc>
@@ -3382,7 +3382,7 @@
       </w:pPr>
       <w:r>
         <w:rPr>
-          <w:rFonts w:ascii="Calibri" w:hAnsi="Calibri" w:eastAsia="Heiti TC"/>
+          <w:rFonts w:ascii="Calibri" w:hAnsi="Calibri" w:eastAsia="Hiragino Sans GB"/>
           <w:b w:val="0"/>
           <w:i/>
           <w:color w:val="667085"/>
@@ -3412,7 +3412,7 @@
     </w:pPr>
     <w:r>
       <w:rPr>
-        <w:rFonts w:ascii="Calibri" w:hAnsi="Calibri" w:eastAsia="Heiti TC"/>
+        <w:rFonts w:ascii="Calibri" w:hAnsi="Calibri" w:eastAsia="Hiragino Sans GB"/>
         <w:color w:val="667085"/>
         <w:sz w:val="17"/>
       </w:rPr>
@@ -3431,7 +3431,7 @@
     <w:r/>
     <w:r>
       <w:rPr>
-        <w:rFonts w:ascii="Calibri" w:hAnsi="Calibri" w:eastAsia="Heiti TC"/>
+        <w:rFonts w:ascii="Calibri" w:hAnsi="Calibri" w:eastAsia="Hiragino Sans GB"/>
         <w:color w:val="667085"/>
         <w:sz w:val="18"/>
       </w:rPr>
@@ -3808,7 +3808,7 @@
       <w:spacing w:after="120" w:line="264" w:lineRule="auto"/>
     </w:pPr>
     <w:rPr>
-      <w:rFonts w:ascii="Calibri" w:hAnsi="Calibri" w:eastAsia="Heiti TC"/>
+      <w:rFonts w:ascii="Calibri" w:hAnsi="Calibri" w:eastAsia="Hiragino Sans GB"/>
       <w:b w:val="0"/>
       <w:color w:val="111827"/>
       <w:sz w:val="22"/>
@@ -3873,7 +3873,7 @@
       <w:outlineLvl w:val="0"/>
     </w:pPr>
     <w:rPr>
-      <w:rFonts w:asciiTheme="majorHAnsi" w:eastAsiaTheme="majorEastAsia" w:hAnsiTheme="majorHAnsi" w:cstheme="majorBidi" w:ascii="Calibri" w:hAnsi="Calibri" w:eastAsia="Heiti TC"/>
+      <w:rFonts w:asciiTheme="majorHAnsi" w:eastAsiaTheme="majorEastAsia" w:hAnsiTheme="majorHAnsi" w:cstheme="majorBidi" w:ascii="Calibri" w:hAnsi="Calibri" w:eastAsia="Hiragino Sans GB"/>
       <w:b/>
       <w:bCs/>
       <w:color w:val="2E74B5"/>
@@ -3897,7 +3897,7 @@
       <w:outlineLvl w:val="1"/>
     </w:pPr>
     <w:rPr>
-      <w:rFonts w:asciiTheme="majorHAnsi" w:eastAsiaTheme="majorEastAsia" w:hAnsiTheme="majorHAnsi" w:cstheme="majorBidi" w:ascii="Calibri" w:hAnsi="Calibri" w:eastAsia="Heiti TC"/>
+      <w:rFonts w:asciiTheme="majorHAnsi" w:eastAsiaTheme="majorEastAsia" w:hAnsiTheme="majorHAnsi" w:cstheme="majorBidi" w:ascii="Calibri" w:hAnsi="Calibri" w:eastAsia="Hiragino Sans GB"/>
       <w:b/>
       <w:bCs/>
       <w:color w:val="2E74B5"/>
@@ -3921,7 +3921,7 @@
       <w:outlineLvl w:val="2"/>
     </w:pPr>
     <w:rPr>
-      <w:rFonts w:asciiTheme="majorHAnsi" w:eastAsiaTheme="majorEastAsia" w:hAnsiTheme="majorHAnsi" w:cstheme="majorBidi" w:ascii="Calibri" w:hAnsi="Calibri" w:eastAsia="Heiti TC"/>
+      <w:rFonts w:asciiTheme="majorHAnsi" w:eastAsiaTheme="majorEastAsia" w:hAnsiTheme="majorHAnsi" w:cstheme="majorBidi" w:ascii="Calibri" w:hAnsi="Calibri" w:eastAsia="Hiragino Sans GB"/>
       <w:b/>
       <w:bCs/>
       <w:color w:val="1F4D78"/>
@@ -4163,7 +4163,7 @@
       <w:contextualSpacing/>
     </w:pPr>
     <w:rPr>
-      <w:rFonts w:asciiTheme="majorHAnsi" w:eastAsiaTheme="majorEastAsia" w:hAnsiTheme="majorHAnsi" w:cstheme="majorBidi" w:ascii="Calibri" w:hAnsi="Calibri" w:eastAsia="Heiti TC"/>
+      <w:rFonts w:asciiTheme="majorHAnsi" w:eastAsiaTheme="majorEastAsia" w:hAnsiTheme="majorHAnsi" w:cstheme="majorBidi" w:ascii="Calibri" w:hAnsi="Calibri" w:eastAsia="Hiragino Sans GB"/>
       <w:b/>
       <w:color w:val="0B2545"/>
       <w:spacing w:val="5"/>
@@ -4201,7 +4201,7 @@
       </w:numPr>
     </w:pPr>
     <w:rPr>
-      <w:rFonts w:asciiTheme="majorHAnsi" w:eastAsiaTheme="majorEastAsia" w:hAnsiTheme="majorHAnsi" w:cstheme="majorBidi" w:ascii="Calibri" w:hAnsi="Calibri" w:eastAsia="Heiti TC"/>
+      <w:rFonts w:asciiTheme="majorHAnsi" w:eastAsiaTheme="majorEastAsia" w:hAnsiTheme="majorHAnsi" w:cstheme="majorBidi" w:ascii="Calibri" w:hAnsi="Calibri" w:eastAsia="Hiragino Sans GB"/>
       <w:b w:val="0"/>
       <w:i/>
       <w:iCs/>

</xml_diff>